<commit_message>
Remove temporary log files from documentation
</commit_message>
<xml_diff>
--- a/documentation/test log.docx
+++ b/documentation/test log.docx
@@ -762,31 +762,53 @@
     <w:p/>
     <w:p>
       <w:pPr>
+        <w:rPr>
+          <w:rFonts w:asciiTheme="majorHAnsi" w:eastAsiaTheme="majorEastAsia" w:hAnsiTheme="majorHAnsi" w:cstheme="majorBidi"/>
+          <w:color w:val="0F4761" w:themeColor="accent1" w:themeShade="BF"/>
+          <w:sz w:val="40"/>
+          <w:szCs w:val="40"/>
+        </w:rPr>
+      </w:pPr>
+      <w:r>
+        <w:br w:type="page"/>
+      </w:r>
+    </w:p>
+    <w:p>
+      <w:pPr>
         <w:pStyle w:val="Heading1"/>
       </w:pPr>
       <w:r>
+        <w:lastRenderedPageBreak/>
         <w:t>Test log</w:t>
+      </w:r>
+    </w:p>
+    <w:p>
+      <w:pPr>
+        <w:pStyle w:val="Heading2"/>
+      </w:pPr>
+      <w:r>
+        <w:t>navigation</w:t>
       </w:r>
     </w:p>
     <w:tbl>
       <w:tblPr>
         <w:tblStyle w:val="TableGrid"/>
-        <w:tblW w:w="11199" w:type="dxa"/>
+        <w:tblW w:w="11624" w:type="dxa"/>
         <w:tblInd w:w="-1281" w:type="dxa"/>
         <w:tblLook w:val="04A0" w:firstRow="1" w:lastRow="0" w:firstColumn="1" w:lastColumn="0" w:noHBand="0" w:noVBand="1"/>
       </w:tblPr>
       <w:tblGrid>
-        <w:gridCol w:w="1419"/>
-        <w:gridCol w:w="1842"/>
-        <w:gridCol w:w="2693"/>
+        <w:gridCol w:w="1985"/>
+        <w:gridCol w:w="2126"/>
+        <w:gridCol w:w="1843"/>
         <w:gridCol w:w="1559"/>
         <w:gridCol w:w="1276"/>
-        <w:gridCol w:w="2410"/>
+        <w:gridCol w:w="2835"/>
       </w:tblGrid>
       <w:tr>
         <w:tc>
           <w:tcPr>
-            <w:tcW w:w="1418" w:type="dxa"/>
+            <w:tcW w:w="1985" w:type="dxa"/>
           </w:tcPr>
           <w:p>
             <w:r>
@@ -796,17 +818,794 @@
         </w:tc>
         <w:tc>
           <w:tcPr>
+            <w:tcW w:w="2126" w:type="dxa"/>
+          </w:tcPr>
+          <w:p>
+            <w:r>
+              <w:t xml:space="preserve">Test data to be used (if required) </w:t>
+            </w:r>
+          </w:p>
+        </w:tc>
+        <w:tc>
+          <w:tcPr>
             <w:tcW w:w="1843" w:type="dxa"/>
           </w:tcPr>
           <w:p>
             <w:r>
+              <w:t xml:space="preserve">Type of testing </w:t>
+            </w:r>
+          </w:p>
+        </w:tc>
+        <w:tc>
+          <w:tcPr>
+            <w:tcW w:w="1559" w:type="dxa"/>
+          </w:tcPr>
+          <w:p>
+            <w:r>
+              <w:t xml:space="preserve">Expected outcome </w:t>
+            </w:r>
+          </w:p>
+        </w:tc>
+        <w:tc>
+          <w:tcPr>
+            <w:tcW w:w="1276" w:type="dxa"/>
+          </w:tcPr>
+          <w:p>
+            <w:r>
+              <w:t xml:space="preserve">Actual outcome </w:t>
+            </w:r>
+          </w:p>
+        </w:tc>
+        <w:tc>
+          <w:tcPr>
+            <w:tcW w:w="2835" w:type="dxa"/>
+          </w:tcPr>
+          <w:p>
+            <w:r>
+              <w:t>Comments and intended actions</w:t>
+            </w:r>
+          </w:p>
+        </w:tc>
+      </w:tr>
+      <w:tr>
+        <w:tc>
+          <w:tcPr>
+            <w:tcW w:w="1985" w:type="dxa"/>
+          </w:tcPr>
+          <w:p>
+            <w:r>
+              <w:t>Testing of</w:t>
+            </w:r>
+            <w:r>
+              <w:t xml:space="preserve"> navigation links on</w:t>
+            </w:r>
+            <w:r>
+              <w:t xml:space="preserve"> home page </w:t>
+            </w:r>
+          </w:p>
+        </w:tc>
+        <w:tc>
+          <w:tcPr>
+            <w:tcW w:w="2126" w:type="dxa"/>
+          </w:tcPr>
+          <w:p>
+            <w:r>
+              <w:t>N/a</w:t>
+            </w:r>
+          </w:p>
+        </w:tc>
+        <w:tc>
+          <w:tcPr>
+            <w:tcW w:w="1843" w:type="dxa"/>
+          </w:tcPr>
+          <w:p>
+            <w:r>
+              <w:t>Unit testing, functionality testing</w:t>
+            </w:r>
+          </w:p>
+        </w:tc>
+        <w:tc>
+          <w:tcPr>
+            <w:tcW w:w="1559" w:type="dxa"/>
+          </w:tcPr>
+          <w:p>
+            <w:r>
+              <w:t xml:space="preserve">All the links work as expected or give the proper error page </w:t>
+            </w:r>
+          </w:p>
+        </w:tc>
+        <w:tc>
+          <w:tcPr>
+            <w:tcW w:w="1276" w:type="dxa"/>
+          </w:tcPr>
+          <w:p>
+            <w:r>
+              <w:t xml:space="preserve">All links work as expected or give the proper error page </w:t>
+            </w:r>
+          </w:p>
+        </w:tc>
+        <w:tc>
+          <w:tcPr>
+            <w:tcW w:w="2835" w:type="dxa"/>
+          </w:tcPr>
+          <w:p>
+            <w:r>
+              <w:t>n/a</w:t>
+            </w:r>
+          </w:p>
+        </w:tc>
+      </w:tr>
+      <w:tr>
+        <w:tc>
+          <w:tcPr>
+            <w:tcW w:w="1985" w:type="dxa"/>
+          </w:tcPr>
+          <w:p>
+            <w:r>
+              <w:t xml:space="preserve">Testing of navigation links on </w:t>
+            </w:r>
+            <w:r>
+              <w:t>about</w:t>
+            </w:r>
+            <w:r>
+              <w:t xml:space="preserve"> page </w:t>
+            </w:r>
+          </w:p>
+        </w:tc>
+        <w:tc>
+          <w:tcPr>
+            <w:tcW w:w="2126" w:type="dxa"/>
+          </w:tcPr>
+          <w:p>
+            <w:r>
+              <w:t>N/a</w:t>
+            </w:r>
+          </w:p>
+        </w:tc>
+        <w:tc>
+          <w:tcPr>
+            <w:tcW w:w="1843" w:type="dxa"/>
+          </w:tcPr>
+          <w:p>
+            <w:r>
+              <w:t>Unit testing, functionality testing</w:t>
+            </w:r>
+          </w:p>
+        </w:tc>
+        <w:tc>
+          <w:tcPr>
+            <w:tcW w:w="1559" w:type="dxa"/>
+          </w:tcPr>
+          <w:p>
+            <w:r>
+              <w:t xml:space="preserve">All the links work as expected or give the proper error page </w:t>
+            </w:r>
+          </w:p>
+        </w:tc>
+        <w:tc>
+          <w:tcPr>
+            <w:tcW w:w="1276" w:type="dxa"/>
+          </w:tcPr>
+          <w:p>
+            <w:r>
+              <w:t xml:space="preserve">All links work as expected or give the proper error page </w:t>
+            </w:r>
+          </w:p>
+        </w:tc>
+        <w:tc>
+          <w:tcPr>
+            <w:tcW w:w="2835" w:type="dxa"/>
+          </w:tcPr>
+          <w:p>
+            <w:r>
+              <w:t>n/a</w:t>
+            </w:r>
+          </w:p>
+        </w:tc>
+      </w:tr>
+      <w:tr>
+        <w:tc>
+          <w:tcPr>
+            <w:tcW w:w="1985" w:type="dxa"/>
+          </w:tcPr>
+          <w:p>
+            <w:r>
+              <w:t xml:space="preserve">Testing of navigation links on </w:t>
+            </w:r>
+            <w:r>
+              <w:t>courses</w:t>
+            </w:r>
+            <w:r>
+              <w:t xml:space="preserve"> page </w:t>
+            </w:r>
+          </w:p>
+        </w:tc>
+        <w:tc>
+          <w:tcPr>
+            <w:tcW w:w="2126" w:type="dxa"/>
+          </w:tcPr>
+          <w:p>
+            <w:r>
+              <w:t>N/a</w:t>
+            </w:r>
+          </w:p>
+        </w:tc>
+        <w:tc>
+          <w:tcPr>
+            <w:tcW w:w="1843" w:type="dxa"/>
+          </w:tcPr>
+          <w:p>
+            <w:r>
+              <w:t>Unit testing, functionality testing</w:t>
+            </w:r>
+          </w:p>
+        </w:tc>
+        <w:tc>
+          <w:tcPr>
+            <w:tcW w:w="1559" w:type="dxa"/>
+          </w:tcPr>
+          <w:p>
+            <w:r>
+              <w:t xml:space="preserve">All the links work as expected or give the proper error page </w:t>
+            </w:r>
+          </w:p>
+        </w:tc>
+        <w:tc>
+          <w:tcPr>
+            <w:tcW w:w="1276" w:type="dxa"/>
+          </w:tcPr>
+          <w:p>
+            <w:r>
+              <w:t xml:space="preserve">All links work as expected or give the proper error page </w:t>
+            </w:r>
+          </w:p>
+        </w:tc>
+        <w:tc>
+          <w:tcPr>
+            <w:tcW w:w="2835" w:type="dxa"/>
+          </w:tcPr>
+          <w:p>
+            <w:r>
+              <w:t>n/a</w:t>
+            </w:r>
+          </w:p>
+        </w:tc>
+      </w:tr>
+      <w:tr>
+        <w:tc>
+          <w:tcPr>
+            <w:tcW w:w="1985" w:type="dxa"/>
+          </w:tcPr>
+          <w:p>
+            <w:r>
+              <w:t xml:space="preserve">Testing of navigation links on </w:t>
+            </w:r>
+            <w:r>
+              <w:t>weather</w:t>
+            </w:r>
+            <w:r>
+              <w:t xml:space="preserve"> page </w:t>
+            </w:r>
+          </w:p>
+        </w:tc>
+        <w:tc>
+          <w:tcPr>
+            <w:tcW w:w="2126" w:type="dxa"/>
+          </w:tcPr>
+          <w:p>
+            <w:r>
+              <w:t>N/a</w:t>
+            </w:r>
+          </w:p>
+        </w:tc>
+        <w:tc>
+          <w:tcPr>
+            <w:tcW w:w="1843" w:type="dxa"/>
+          </w:tcPr>
+          <w:p>
+            <w:r>
+              <w:t>Unit testing, functionality testing</w:t>
+            </w:r>
+          </w:p>
+        </w:tc>
+        <w:tc>
+          <w:tcPr>
+            <w:tcW w:w="1559" w:type="dxa"/>
+          </w:tcPr>
+          <w:p>
+            <w:r>
+              <w:t xml:space="preserve">All the links work as expected or give the proper error page </w:t>
+            </w:r>
+          </w:p>
+        </w:tc>
+        <w:tc>
+          <w:tcPr>
+            <w:tcW w:w="1276" w:type="dxa"/>
+          </w:tcPr>
+          <w:p>
+            <w:r>
+              <w:t xml:space="preserve">All links work as expected or give the proper error page </w:t>
+            </w:r>
+          </w:p>
+        </w:tc>
+        <w:tc>
+          <w:tcPr>
+            <w:tcW w:w="2835" w:type="dxa"/>
+          </w:tcPr>
+          <w:p>
+            <w:r>
+              <w:t>n/a</w:t>
+            </w:r>
+          </w:p>
+        </w:tc>
+      </w:tr>
+      <w:tr>
+        <w:tc>
+          <w:tcPr>
+            <w:tcW w:w="1985" w:type="dxa"/>
+          </w:tcPr>
+          <w:p>
+            <w:r>
+              <w:t xml:space="preserve">Testing of navigation links on </w:t>
+            </w:r>
+            <w:r>
+              <w:t>booking</w:t>
+            </w:r>
+            <w:r>
+              <w:t xml:space="preserve"> page </w:t>
+            </w:r>
+          </w:p>
+        </w:tc>
+        <w:tc>
+          <w:tcPr>
+            <w:tcW w:w="2126" w:type="dxa"/>
+          </w:tcPr>
+          <w:p>
+            <w:r>
+              <w:t>N/a</w:t>
+            </w:r>
+          </w:p>
+        </w:tc>
+        <w:tc>
+          <w:tcPr>
+            <w:tcW w:w="1843" w:type="dxa"/>
+          </w:tcPr>
+          <w:p>
+            <w:r>
+              <w:t>Unit testing, functionality testing</w:t>
+            </w:r>
+          </w:p>
+        </w:tc>
+        <w:tc>
+          <w:tcPr>
+            <w:tcW w:w="1559" w:type="dxa"/>
+          </w:tcPr>
+          <w:p>
+            <w:r>
+              <w:t xml:space="preserve">All the links work as expected or give the proper error page </w:t>
+            </w:r>
+          </w:p>
+        </w:tc>
+        <w:tc>
+          <w:tcPr>
+            <w:tcW w:w="1276" w:type="dxa"/>
+          </w:tcPr>
+          <w:p>
+            <w:r>
+              <w:t xml:space="preserve">All links work as expected or give the proper error page </w:t>
+            </w:r>
+          </w:p>
+        </w:tc>
+        <w:tc>
+          <w:tcPr>
+            <w:tcW w:w="2835" w:type="dxa"/>
+          </w:tcPr>
+          <w:p>
+            <w:r>
+              <w:t>n/a</w:t>
+            </w:r>
+          </w:p>
+        </w:tc>
+      </w:tr>
+      <w:tr>
+        <w:tc>
+          <w:tcPr>
+            <w:tcW w:w="1985" w:type="dxa"/>
+          </w:tcPr>
+          <w:p>
+            <w:r>
+              <w:t xml:space="preserve">Testing of navigation links on </w:t>
+            </w:r>
+            <w:r>
+              <w:t>sign up</w:t>
+            </w:r>
+            <w:r>
+              <w:t xml:space="preserve"> page </w:t>
+            </w:r>
+          </w:p>
+        </w:tc>
+        <w:tc>
+          <w:tcPr>
+            <w:tcW w:w="2126" w:type="dxa"/>
+          </w:tcPr>
+          <w:p>
+            <w:r>
+              <w:t>N/a</w:t>
+            </w:r>
+          </w:p>
+        </w:tc>
+        <w:tc>
+          <w:tcPr>
+            <w:tcW w:w="1843" w:type="dxa"/>
+          </w:tcPr>
+          <w:p>
+            <w:r>
+              <w:t>Unit testing, functionality testing</w:t>
+            </w:r>
+          </w:p>
+        </w:tc>
+        <w:tc>
+          <w:tcPr>
+            <w:tcW w:w="1559" w:type="dxa"/>
+          </w:tcPr>
+          <w:p>
+            <w:r>
+              <w:t xml:space="preserve">All the links work as expected or give the proper error page </w:t>
+            </w:r>
+          </w:p>
+        </w:tc>
+        <w:tc>
+          <w:tcPr>
+            <w:tcW w:w="1276" w:type="dxa"/>
+          </w:tcPr>
+          <w:p>
+            <w:r>
+              <w:t xml:space="preserve">All links work as expected or give the proper error page </w:t>
+            </w:r>
+          </w:p>
+        </w:tc>
+        <w:tc>
+          <w:tcPr>
+            <w:tcW w:w="2835" w:type="dxa"/>
+          </w:tcPr>
+          <w:p>
+            <w:r>
+              <w:t>n/a</w:t>
+            </w:r>
+          </w:p>
+          <w:p/>
+        </w:tc>
+      </w:tr>
+      <w:tr>
+        <w:tc>
+          <w:tcPr>
+            <w:tcW w:w="1985" w:type="dxa"/>
+          </w:tcPr>
+          <w:p>
+            <w:r>
+              <w:t xml:space="preserve">Testing of navigation links on </w:t>
+            </w:r>
+            <w:r>
+              <w:t>login</w:t>
+            </w:r>
+            <w:r>
+              <w:t xml:space="preserve"> page </w:t>
+            </w:r>
+          </w:p>
+        </w:tc>
+        <w:tc>
+          <w:tcPr>
+            <w:tcW w:w="2126" w:type="dxa"/>
+          </w:tcPr>
+          <w:p>
+            <w:r>
+              <w:t>N/a</w:t>
+            </w:r>
+          </w:p>
+        </w:tc>
+        <w:tc>
+          <w:tcPr>
+            <w:tcW w:w="1843" w:type="dxa"/>
+          </w:tcPr>
+          <w:p>
+            <w:r>
+              <w:t>Unit testing, functionality testing</w:t>
+            </w:r>
+          </w:p>
+        </w:tc>
+        <w:tc>
+          <w:tcPr>
+            <w:tcW w:w="1559" w:type="dxa"/>
+          </w:tcPr>
+          <w:p>
+            <w:r>
+              <w:t xml:space="preserve">All the links work as expected or give the </w:t>
+            </w:r>
+            <w:r>
+              <w:lastRenderedPageBreak/>
+              <w:t xml:space="preserve">proper error page </w:t>
+            </w:r>
+          </w:p>
+        </w:tc>
+        <w:tc>
+          <w:tcPr>
+            <w:tcW w:w="1276" w:type="dxa"/>
+          </w:tcPr>
+          <w:p>
+            <w:r>
+              <w:lastRenderedPageBreak/>
+              <w:t xml:space="preserve">All links work as expected or give the </w:t>
+            </w:r>
+            <w:r>
+              <w:lastRenderedPageBreak/>
+              <w:t xml:space="preserve">proper error page </w:t>
+            </w:r>
+          </w:p>
+        </w:tc>
+        <w:tc>
+          <w:tcPr>
+            <w:tcW w:w="2835" w:type="dxa"/>
+          </w:tcPr>
+          <w:p>
+            <w:r>
+              <w:lastRenderedPageBreak/>
+              <w:t>n/a</w:t>
+            </w:r>
+          </w:p>
+        </w:tc>
+      </w:tr>
+      <w:tr>
+        <w:tc>
+          <w:tcPr>
+            <w:tcW w:w="1985" w:type="dxa"/>
+          </w:tcPr>
+          <w:p>
+            <w:r>
+              <w:t xml:space="preserve">Testing of navigation links on </w:t>
+            </w:r>
+            <w:r>
+              <w:t>profile</w:t>
+            </w:r>
+            <w:r>
+              <w:t xml:space="preserve"> page </w:t>
+            </w:r>
+          </w:p>
+        </w:tc>
+        <w:tc>
+          <w:tcPr>
+            <w:tcW w:w="2126" w:type="dxa"/>
+          </w:tcPr>
+          <w:p>
+            <w:r>
+              <w:t>N/a</w:t>
+            </w:r>
+          </w:p>
+        </w:tc>
+        <w:tc>
+          <w:tcPr>
+            <w:tcW w:w="1843" w:type="dxa"/>
+          </w:tcPr>
+          <w:p>
+            <w:r>
+              <w:t>Unit testing, functionality testing</w:t>
+            </w:r>
+          </w:p>
+        </w:tc>
+        <w:tc>
+          <w:tcPr>
+            <w:tcW w:w="1559" w:type="dxa"/>
+          </w:tcPr>
+          <w:p>
+            <w:r>
+              <w:t xml:space="preserve">All the links work as expected or give the proper error page </w:t>
+            </w:r>
+          </w:p>
+        </w:tc>
+        <w:tc>
+          <w:tcPr>
+            <w:tcW w:w="1276" w:type="dxa"/>
+          </w:tcPr>
+          <w:p>
+            <w:r>
+              <w:t xml:space="preserve">All links work as expected or give the proper error page </w:t>
+            </w:r>
+          </w:p>
+        </w:tc>
+        <w:tc>
+          <w:tcPr>
+            <w:tcW w:w="2835" w:type="dxa"/>
+          </w:tcPr>
+          <w:p>
+            <w:r>
+              <w:t>n/a</w:t>
+            </w:r>
+          </w:p>
+        </w:tc>
+      </w:tr>
+      <w:tr>
+        <w:tc>
+          <w:tcPr>
+            <w:tcW w:w="1985" w:type="dxa"/>
+          </w:tcPr>
+          <w:p>
+            <w:r>
+              <w:t xml:space="preserve">Testing of navigation links on </w:t>
+            </w:r>
+            <w:r>
+              <w:t>testing</w:t>
+            </w:r>
+            <w:r>
+              <w:t xml:space="preserve"> page </w:t>
+            </w:r>
+          </w:p>
+        </w:tc>
+        <w:tc>
+          <w:tcPr>
+            <w:tcW w:w="2126" w:type="dxa"/>
+          </w:tcPr>
+          <w:p>
+            <w:r>
+              <w:t>N/a</w:t>
+            </w:r>
+          </w:p>
+        </w:tc>
+        <w:tc>
+          <w:tcPr>
+            <w:tcW w:w="1843" w:type="dxa"/>
+          </w:tcPr>
+          <w:p>
+            <w:r>
+              <w:t>Unit testing, functionality testing</w:t>
+            </w:r>
+          </w:p>
+        </w:tc>
+        <w:tc>
+          <w:tcPr>
+            <w:tcW w:w="1559" w:type="dxa"/>
+          </w:tcPr>
+          <w:p>
+            <w:r>
+              <w:t xml:space="preserve">All the links work as expected or give the proper error page </w:t>
+            </w:r>
+          </w:p>
+        </w:tc>
+        <w:tc>
+          <w:tcPr>
+            <w:tcW w:w="1276" w:type="dxa"/>
+          </w:tcPr>
+          <w:p>
+            <w:r>
+              <w:t xml:space="preserve">All links work as expected or give the proper error page </w:t>
+            </w:r>
+          </w:p>
+        </w:tc>
+        <w:tc>
+          <w:tcPr>
+            <w:tcW w:w="2835" w:type="dxa"/>
+          </w:tcPr>
+          <w:p>
+            <w:r>
+              <w:t>n/a</w:t>
+            </w:r>
+          </w:p>
+        </w:tc>
+      </w:tr>
+      <w:tr>
+        <w:tc>
+          <w:tcPr>
+            <w:tcW w:w="1985" w:type="dxa"/>
+          </w:tcPr>
+          <w:p>
+            <w:r>
+              <w:t xml:space="preserve">Testing of navigation links on </w:t>
+            </w:r>
+            <w:r>
+              <w:t>user info</w:t>
+            </w:r>
+            <w:r>
+              <w:t xml:space="preserve"> page </w:t>
+            </w:r>
+          </w:p>
+        </w:tc>
+        <w:tc>
+          <w:tcPr>
+            <w:tcW w:w="2126" w:type="dxa"/>
+          </w:tcPr>
+          <w:p>
+            <w:r>
+              <w:t>N/a</w:t>
+            </w:r>
+          </w:p>
+        </w:tc>
+        <w:tc>
+          <w:tcPr>
+            <w:tcW w:w="1843" w:type="dxa"/>
+          </w:tcPr>
+          <w:p>
+            <w:r>
+              <w:t>Unit testing, functionality testing</w:t>
+            </w:r>
+          </w:p>
+        </w:tc>
+        <w:tc>
+          <w:tcPr>
+            <w:tcW w:w="1559" w:type="dxa"/>
+          </w:tcPr>
+          <w:p>
+            <w:r>
+              <w:t xml:space="preserve">All the links work as expected or give the proper error page </w:t>
+            </w:r>
+          </w:p>
+        </w:tc>
+        <w:tc>
+          <w:tcPr>
+            <w:tcW w:w="1276" w:type="dxa"/>
+          </w:tcPr>
+          <w:p>
+            <w:r>
+              <w:t xml:space="preserve">All links work as expected or give the proper error page </w:t>
+            </w:r>
+          </w:p>
+        </w:tc>
+        <w:tc>
+          <w:tcPr>
+            <w:tcW w:w="2835" w:type="dxa"/>
+          </w:tcPr>
+          <w:p>
+            <w:r>
+              <w:t>n/a</w:t>
+            </w:r>
+          </w:p>
+        </w:tc>
+      </w:tr>
+    </w:tbl>
+    <w:p>
+      <w:pPr>
+        <w:pStyle w:val="Heading2"/>
+      </w:pPr>
+      <w:r>
+        <w:t>Input testing</w:t>
+      </w:r>
+    </w:p>
+    <w:tbl>
+      <w:tblPr>
+        <w:tblStyle w:val="TableGrid"/>
+        <w:tblW w:w="11624" w:type="dxa"/>
+        <w:tblInd w:w="-1281" w:type="dxa"/>
+        <w:tblLook w:val="04A0" w:firstRow="1" w:lastRow="0" w:firstColumn="1" w:lastColumn="0" w:noHBand="0" w:noVBand="1"/>
+      </w:tblPr>
+      <w:tblGrid>
+        <w:gridCol w:w="1813"/>
+        <w:gridCol w:w="2224"/>
+        <w:gridCol w:w="1561"/>
+        <w:gridCol w:w="1544"/>
+        <w:gridCol w:w="1954"/>
+        <w:gridCol w:w="2528"/>
+      </w:tblGrid>
+      <w:tr>
+        <w:tc>
+          <w:tcPr>
+            <w:tcW w:w="1813" w:type="dxa"/>
+          </w:tcPr>
+          <w:p>
+            <w:r>
+              <w:t xml:space="preserve">Description of test </w:t>
+            </w:r>
+          </w:p>
+        </w:tc>
+        <w:tc>
+          <w:tcPr>
+            <w:tcW w:w="2224" w:type="dxa"/>
+          </w:tcPr>
+          <w:p>
+            <w:r>
               <w:t xml:space="preserve">Test data to be used (if required) </w:t>
             </w:r>
           </w:p>
         </w:tc>
         <w:tc>
           <w:tcPr>
-            <w:tcW w:w="2693" w:type="dxa"/>
+            <w:tcW w:w="1561" w:type="dxa"/>
           </w:tcPr>
           <w:p>
             <w:r>
@@ -816,7 +1615,7 @@
         </w:tc>
         <w:tc>
           <w:tcPr>
-            <w:tcW w:w="1559" w:type="dxa"/>
+            <w:tcW w:w="1544" w:type="dxa"/>
           </w:tcPr>
           <w:p>
             <w:r>
@@ -826,7 +1625,7 @@
         </w:tc>
         <w:tc>
           <w:tcPr>
-            <w:tcW w:w="1276" w:type="dxa"/>
+            <w:tcW w:w="1954" w:type="dxa"/>
           </w:tcPr>
           <w:p>
             <w:r>
@@ -836,7 +1635,7 @@
         </w:tc>
         <w:tc>
           <w:tcPr>
-            <w:tcW w:w="2410" w:type="dxa"/>
+            <w:tcW w:w="2528" w:type="dxa"/>
           </w:tcPr>
           <w:p>
             <w:r>
@@ -848,227 +1647,677 @@
       <w:tr>
         <w:tc>
           <w:tcPr>
-            <w:tcW w:w="1418" w:type="dxa"/>
-          </w:tcPr>
-          <w:p/>
-        </w:tc>
-        <w:tc>
-          <w:tcPr>
-            <w:tcW w:w="1843" w:type="dxa"/>
-          </w:tcPr>
-          <w:p/>
-        </w:tc>
-        <w:tc>
-          <w:tcPr>
-            <w:tcW w:w="2693" w:type="dxa"/>
-          </w:tcPr>
-          <w:p/>
-        </w:tc>
-        <w:tc>
-          <w:tcPr>
-            <w:tcW w:w="1559" w:type="dxa"/>
-          </w:tcPr>
-          <w:p/>
-        </w:tc>
-        <w:tc>
-          <w:tcPr>
-            <w:tcW w:w="1276" w:type="dxa"/>
-          </w:tcPr>
-          <w:p/>
-        </w:tc>
-        <w:tc>
-          <w:tcPr>
-            <w:tcW w:w="2410" w:type="dxa"/>
-          </w:tcPr>
-          <w:p/>
-        </w:tc>
-      </w:tr>
-      <w:tr>
-        <w:tc>
-          <w:tcPr>
-            <w:tcW w:w="1418" w:type="dxa"/>
-          </w:tcPr>
-          <w:p/>
-        </w:tc>
-        <w:tc>
-          <w:tcPr>
-            <w:tcW w:w="1843" w:type="dxa"/>
-          </w:tcPr>
-          <w:p/>
-        </w:tc>
-        <w:tc>
-          <w:tcPr>
-            <w:tcW w:w="2693" w:type="dxa"/>
-          </w:tcPr>
-          <w:p/>
-        </w:tc>
-        <w:tc>
-          <w:tcPr>
-            <w:tcW w:w="1559" w:type="dxa"/>
-          </w:tcPr>
-          <w:p/>
-        </w:tc>
-        <w:tc>
-          <w:tcPr>
-            <w:tcW w:w="1276" w:type="dxa"/>
-          </w:tcPr>
-          <w:p/>
-        </w:tc>
-        <w:tc>
-          <w:tcPr>
-            <w:tcW w:w="2410" w:type="dxa"/>
-          </w:tcPr>
-          <w:p/>
-        </w:tc>
-      </w:tr>
-      <w:tr>
-        <w:tc>
-          <w:tcPr>
-            <w:tcW w:w="1418" w:type="dxa"/>
-          </w:tcPr>
-          <w:p/>
-        </w:tc>
-        <w:tc>
-          <w:tcPr>
-            <w:tcW w:w="1843" w:type="dxa"/>
-          </w:tcPr>
-          <w:p/>
-        </w:tc>
-        <w:tc>
-          <w:tcPr>
-            <w:tcW w:w="2693" w:type="dxa"/>
-          </w:tcPr>
-          <w:p/>
-        </w:tc>
-        <w:tc>
-          <w:tcPr>
-            <w:tcW w:w="1559" w:type="dxa"/>
-          </w:tcPr>
-          <w:p/>
-        </w:tc>
-        <w:tc>
-          <w:tcPr>
-            <w:tcW w:w="1276" w:type="dxa"/>
-          </w:tcPr>
-          <w:p/>
-        </w:tc>
-        <w:tc>
-          <w:tcPr>
-            <w:tcW w:w="2410" w:type="dxa"/>
-          </w:tcPr>
-          <w:p/>
-        </w:tc>
-      </w:tr>
-      <w:tr>
-        <w:tc>
-          <w:tcPr>
-            <w:tcW w:w="1418" w:type="dxa"/>
-          </w:tcPr>
-          <w:p/>
-        </w:tc>
-        <w:tc>
-          <w:tcPr>
-            <w:tcW w:w="1843" w:type="dxa"/>
-          </w:tcPr>
-          <w:p/>
-        </w:tc>
-        <w:tc>
-          <w:tcPr>
-            <w:tcW w:w="2693" w:type="dxa"/>
-          </w:tcPr>
-          <w:p/>
-        </w:tc>
-        <w:tc>
-          <w:tcPr>
-            <w:tcW w:w="1559" w:type="dxa"/>
-          </w:tcPr>
-          <w:p/>
-        </w:tc>
-        <w:tc>
-          <w:tcPr>
-            <w:tcW w:w="1276" w:type="dxa"/>
-          </w:tcPr>
-          <w:p/>
-        </w:tc>
-        <w:tc>
-          <w:tcPr>
-            <w:tcW w:w="2410" w:type="dxa"/>
-          </w:tcPr>
-          <w:p/>
-        </w:tc>
-      </w:tr>
-      <w:tr>
-        <w:tc>
-          <w:tcPr>
-            <w:tcW w:w="1418" w:type="dxa"/>
-          </w:tcPr>
-          <w:p/>
-        </w:tc>
-        <w:tc>
-          <w:tcPr>
-            <w:tcW w:w="1843" w:type="dxa"/>
-          </w:tcPr>
-          <w:p/>
-        </w:tc>
-        <w:tc>
-          <w:tcPr>
-            <w:tcW w:w="2693" w:type="dxa"/>
-          </w:tcPr>
-          <w:p/>
-        </w:tc>
-        <w:tc>
-          <w:tcPr>
-            <w:tcW w:w="1559" w:type="dxa"/>
-          </w:tcPr>
-          <w:p/>
-        </w:tc>
-        <w:tc>
-          <w:tcPr>
-            <w:tcW w:w="1276" w:type="dxa"/>
-          </w:tcPr>
-          <w:p/>
-        </w:tc>
-        <w:tc>
-          <w:tcPr>
-            <w:tcW w:w="2410" w:type="dxa"/>
-          </w:tcPr>
-          <w:p/>
-        </w:tc>
-      </w:tr>
-      <w:tr>
-        <w:tc>
-          <w:tcPr>
-            <w:tcW w:w="1418" w:type="dxa"/>
-          </w:tcPr>
-          <w:p/>
-        </w:tc>
-        <w:tc>
-          <w:tcPr>
-            <w:tcW w:w="1843" w:type="dxa"/>
-          </w:tcPr>
-          <w:p/>
-        </w:tc>
-        <w:tc>
-          <w:tcPr>
-            <w:tcW w:w="2693" w:type="dxa"/>
-          </w:tcPr>
-          <w:p/>
-        </w:tc>
-        <w:tc>
-          <w:tcPr>
-            <w:tcW w:w="1559" w:type="dxa"/>
-          </w:tcPr>
-          <w:p/>
-        </w:tc>
-        <w:tc>
-          <w:tcPr>
-            <w:tcW w:w="1276" w:type="dxa"/>
-          </w:tcPr>
-          <w:p/>
-        </w:tc>
-        <w:tc>
-          <w:tcPr>
-            <w:tcW w:w="2410" w:type="dxa"/>
+            <w:tcW w:w="1813" w:type="dxa"/>
+          </w:tcPr>
+          <w:p>
+            <w:r>
+              <w:t xml:space="preserve">Test creating a new user account </w:t>
+            </w:r>
+          </w:p>
+        </w:tc>
+        <w:tc>
+          <w:tcPr>
+            <w:tcW w:w="2224" w:type="dxa"/>
+          </w:tcPr>
+          <w:p>
+            <w:r>
+              <w:t xml:space="preserve">Test1, </w:t>
+            </w:r>
+            <w:hyperlink r:id="rId4" w:history="1">
+              <w:r>
+                <w:rPr>
+                  <w:rStyle w:val="Hyperlink"/>
+                </w:rPr>
+                <w:t>testing@gmail.com</w:t>
+              </w:r>
+            </w:hyperlink>
+          </w:p>
+          <w:p>
+            <w:r>
+              <w:t>, TestPassword12.</w:t>
+            </w:r>
+          </w:p>
+        </w:tc>
+        <w:tc>
+          <w:tcPr>
+            <w:tcW w:w="1561" w:type="dxa"/>
+          </w:tcPr>
+          <w:p>
+            <w:r>
+              <w:t>Input testing</w:t>
+            </w:r>
+          </w:p>
+        </w:tc>
+        <w:tc>
+          <w:tcPr>
+            <w:tcW w:w="1544" w:type="dxa"/>
+          </w:tcPr>
+          <w:p>
+            <w:r>
+              <w:t xml:space="preserve">Account created successfully </w:t>
+            </w:r>
+          </w:p>
+        </w:tc>
+        <w:tc>
+          <w:tcPr>
+            <w:tcW w:w="1954" w:type="dxa"/>
+          </w:tcPr>
+          <w:p>
+            <w:r>
+              <w:t xml:space="preserve">Couldn’t create account with </w:t>
+            </w:r>
+            <w:r>
+              <w:t>TestPassword12.</w:t>
+            </w:r>
+          </w:p>
+        </w:tc>
+        <w:tc>
+          <w:tcPr>
+            <w:tcW w:w="2528" w:type="dxa"/>
+          </w:tcPr>
+          <w:p>
+            <w:r>
+              <w:t xml:space="preserve">Needed to use </w:t>
+            </w:r>
+            <w:r>
+              <w:t>TestPassword1</w:t>
+            </w:r>
+            <w:r>
+              <w:t>.</w:t>
+            </w:r>
+          </w:p>
+        </w:tc>
+      </w:tr>
+      <w:tr>
+        <w:tc>
+          <w:tcPr>
+            <w:tcW w:w="1813" w:type="dxa"/>
+          </w:tcPr>
+          <w:p>
+            <w:r>
+              <w:t>Attempt to delete account</w:t>
+            </w:r>
+          </w:p>
+        </w:tc>
+        <w:tc>
+          <w:tcPr>
+            <w:tcW w:w="2224" w:type="dxa"/>
+          </w:tcPr>
+          <w:p>
+            <w:r>
+              <w:t>2</w:t>
+            </w:r>
+          </w:p>
+        </w:tc>
+        <w:tc>
+          <w:tcPr>
+            <w:tcW w:w="1561" w:type="dxa"/>
+          </w:tcPr>
+          <w:p>
+            <w:r>
+              <w:t xml:space="preserve">Input testing </w:t>
+            </w:r>
+          </w:p>
+        </w:tc>
+        <w:tc>
+          <w:tcPr>
+            <w:tcW w:w="1544" w:type="dxa"/>
+          </w:tcPr>
+          <w:p>
+            <w:r>
+              <w:t xml:space="preserve">Account is deleted </w:t>
+            </w:r>
+          </w:p>
+        </w:tc>
+        <w:tc>
+          <w:tcPr>
+            <w:tcW w:w="1954" w:type="dxa"/>
+          </w:tcPr>
+          <w:p>
+            <w:r>
+              <w:t>Redirected to 404 page</w:t>
+            </w:r>
+          </w:p>
+        </w:tc>
+        <w:tc>
+          <w:tcPr>
+            <w:tcW w:w="2528" w:type="dxa"/>
+          </w:tcPr>
+          <w:p>
+            <w:r>
+              <w:t xml:space="preserve">It did </w:t>
+            </w:r>
+            <w:r>
+              <w:t>delete</w:t>
+            </w:r>
+            <w:r>
+              <w:t xml:space="preserve"> </w:t>
+            </w:r>
+            <w:r>
+              <w:t>successfully</w:t>
+            </w:r>
+            <w:r>
+              <w:t xml:space="preserve"> but redirected to 404 page for some reason</w:t>
+            </w:r>
+          </w:p>
+        </w:tc>
+      </w:tr>
+      <w:tr>
+        <w:tc>
+          <w:tcPr>
+            <w:tcW w:w="1813" w:type="dxa"/>
+          </w:tcPr>
+          <w:p>
+            <w:r>
+              <w:t xml:space="preserve">Test creating a new user account </w:t>
+            </w:r>
+          </w:p>
+        </w:tc>
+        <w:tc>
+          <w:tcPr>
+            <w:tcW w:w="2224" w:type="dxa"/>
+          </w:tcPr>
+          <w:p>
+            <w:r>
+              <w:t xml:space="preserve">Test1, </w:t>
+            </w:r>
+            <w:hyperlink r:id="rId5" w:history="1">
+              <w:r>
+                <w:rPr>
+                  <w:rStyle w:val="Hyperlink"/>
+                </w:rPr>
+                <w:t>testing@gmail.com</w:t>
+              </w:r>
+            </w:hyperlink>
+          </w:p>
+          <w:p>
+            <w:r>
+              <w:t>, TestPassword12.</w:t>
+            </w:r>
+          </w:p>
+        </w:tc>
+        <w:tc>
+          <w:tcPr>
+            <w:tcW w:w="1561" w:type="dxa"/>
+          </w:tcPr>
+          <w:p>
+            <w:r>
+              <w:t>Input testing</w:t>
+            </w:r>
+          </w:p>
+        </w:tc>
+        <w:tc>
+          <w:tcPr>
+            <w:tcW w:w="1544" w:type="dxa"/>
+          </w:tcPr>
+          <w:p>
+            <w:r>
+              <w:t xml:space="preserve">Account created successfully </w:t>
+            </w:r>
+          </w:p>
+        </w:tc>
+        <w:tc>
+          <w:tcPr>
+            <w:tcW w:w="1954" w:type="dxa"/>
+          </w:tcPr>
+          <w:p>
+            <w:r>
+              <w:t xml:space="preserve">Account created successfully </w:t>
+            </w:r>
+          </w:p>
+        </w:tc>
+        <w:tc>
+          <w:tcPr>
+            <w:tcW w:w="2528" w:type="dxa"/>
+          </w:tcPr>
+          <w:p>
+            <w:r>
+              <w:t>Unknown why couldn’t use password previously</w:t>
+            </w:r>
+          </w:p>
+        </w:tc>
+      </w:tr>
+      <w:tr>
+        <w:tc>
+          <w:tcPr>
+            <w:tcW w:w="1813" w:type="dxa"/>
+          </w:tcPr>
+          <w:p>
+            <w:r>
+              <w:t>Attempt to delete account</w:t>
+            </w:r>
+          </w:p>
+        </w:tc>
+        <w:tc>
+          <w:tcPr>
+            <w:tcW w:w="2224" w:type="dxa"/>
+          </w:tcPr>
+          <w:p>
+            <w:r>
+              <w:t>2</w:t>
+            </w:r>
+          </w:p>
+        </w:tc>
+        <w:tc>
+          <w:tcPr>
+            <w:tcW w:w="1561" w:type="dxa"/>
+          </w:tcPr>
+          <w:p>
+            <w:r>
+              <w:t xml:space="preserve">Input testing </w:t>
+            </w:r>
+          </w:p>
+        </w:tc>
+        <w:tc>
+          <w:tcPr>
+            <w:tcW w:w="1544" w:type="dxa"/>
+          </w:tcPr>
+          <w:p>
+            <w:r>
+              <w:t xml:space="preserve">Account is deleted </w:t>
+            </w:r>
+          </w:p>
+        </w:tc>
+        <w:tc>
+          <w:tcPr>
+            <w:tcW w:w="1954" w:type="dxa"/>
+          </w:tcPr>
+          <w:p>
+            <w:r>
+              <w:t xml:space="preserve">Account is deleted </w:t>
+            </w:r>
+          </w:p>
+        </w:tc>
+        <w:tc>
+          <w:tcPr>
+            <w:tcW w:w="2528" w:type="dxa"/>
+          </w:tcPr>
+          <w:p>
+            <w:r>
+              <w:t xml:space="preserve">It did delete successfully </w:t>
+            </w:r>
+            <w:r>
+              <w:t>as I fixed the pathing in main.py</w:t>
+            </w:r>
+          </w:p>
+        </w:tc>
+      </w:tr>
+      <w:tr>
+        <w:tc>
+          <w:tcPr>
+            <w:tcW w:w="1813" w:type="dxa"/>
+          </w:tcPr>
+          <w:p/>
+        </w:tc>
+        <w:tc>
+          <w:tcPr>
+            <w:tcW w:w="2224" w:type="dxa"/>
+          </w:tcPr>
+          <w:p/>
+        </w:tc>
+        <w:tc>
+          <w:tcPr>
+            <w:tcW w:w="1561" w:type="dxa"/>
+          </w:tcPr>
+          <w:p/>
+        </w:tc>
+        <w:tc>
+          <w:tcPr>
+            <w:tcW w:w="1544" w:type="dxa"/>
+          </w:tcPr>
+          <w:p/>
+        </w:tc>
+        <w:tc>
+          <w:tcPr>
+            <w:tcW w:w="1954" w:type="dxa"/>
+          </w:tcPr>
+          <w:p/>
+        </w:tc>
+        <w:tc>
+          <w:tcPr>
+            <w:tcW w:w="2528" w:type="dxa"/>
+          </w:tcPr>
+          <w:p/>
+        </w:tc>
+      </w:tr>
+      <w:tr>
+        <w:tc>
+          <w:tcPr>
+            <w:tcW w:w="1813" w:type="dxa"/>
+          </w:tcPr>
+          <w:p/>
+        </w:tc>
+        <w:tc>
+          <w:tcPr>
+            <w:tcW w:w="2224" w:type="dxa"/>
+          </w:tcPr>
+          <w:p/>
+        </w:tc>
+        <w:tc>
+          <w:tcPr>
+            <w:tcW w:w="1561" w:type="dxa"/>
+          </w:tcPr>
+          <w:p/>
+        </w:tc>
+        <w:tc>
+          <w:tcPr>
+            <w:tcW w:w="1544" w:type="dxa"/>
+          </w:tcPr>
+          <w:p/>
+        </w:tc>
+        <w:tc>
+          <w:tcPr>
+            <w:tcW w:w="1954" w:type="dxa"/>
+          </w:tcPr>
+          <w:p/>
+        </w:tc>
+        <w:tc>
+          <w:tcPr>
+            <w:tcW w:w="2528" w:type="dxa"/>
+          </w:tcPr>
+          <w:p/>
+        </w:tc>
+      </w:tr>
+      <w:tr>
+        <w:tc>
+          <w:tcPr>
+            <w:tcW w:w="1813" w:type="dxa"/>
+          </w:tcPr>
+          <w:p/>
+        </w:tc>
+        <w:tc>
+          <w:tcPr>
+            <w:tcW w:w="2224" w:type="dxa"/>
+          </w:tcPr>
+          <w:p/>
+        </w:tc>
+        <w:tc>
+          <w:tcPr>
+            <w:tcW w:w="1561" w:type="dxa"/>
+          </w:tcPr>
+          <w:p/>
+        </w:tc>
+        <w:tc>
+          <w:tcPr>
+            <w:tcW w:w="1544" w:type="dxa"/>
+          </w:tcPr>
+          <w:p/>
+        </w:tc>
+        <w:tc>
+          <w:tcPr>
+            <w:tcW w:w="1954" w:type="dxa"/>
+          </w:tcPr>
+          <w:p/>
+        </w:tc>
+        <w:tc>
+          <w:tcPr>
+            <w:tcW w:w="2528" w:type="dxa"/>
+          </w:tcPr>
+          <w:p/>
+        </w:tc>
+      </w:tr>
+      <w:tr>
+        <w:tc>
+          <w:tcPr>
+            <w:tcW w:w="1813" w:type="dxa"/>
+          </w:tcPr>
+          <w:p/>
+        </w:tc>
+        <w:tc>
+          <w:tcPr>
+            <w:tcW w:w="2224" w:type="dxa"/>
+          </w:tcPr>
+          <w:p/>
+        </w:tc>
+        <w:tc>
+          <w:tcPr>
+            <w:tcW w:w="1561" w:type="dxa"/>
+          </w:tcPr>
+          <w:p/>
+        </w:tc>
+        <w:tc>
+          <w:tcPr>
+            <w:tcW w:w="1544" w:type="dxa"/>
+          </w:tcPr>
+          <w:p/>
+        </w:tc>
+        <w:tc>
+          <w:tcPr>
+            <w:tcW w:w="1954" w:type="dxa"/>
+          </w:tcPr>
+          <w:p/>
+        </w:tc>
+        <w:tc>
+          <w:tcPr>
+            <w:tcW w:w="2528" w:type="dxa"/>
+          </w:tcPr>
+          <w:p/>
+        </w:tc>
+      </w:tr>
+      <w:tr>
+        <w:tc>
+          <w:tcPr>
+            <w:tcW w:w="1813" w:type="dxa"/>
+          </w:tcPr>
+          <w:p/>
+        </w:tc>
+        <w:tc>
+          <w:tcPr>
+            <w:tcW w:w="2224" w:type="dxa"/>
+          </w:tcPr>
+          <w:p/>
+        </w:tc>
+        <w:tc>
+          <w:tcPr>
+            <w:tcW w:w="1561" w:type="dxa"/>
+          </w:tcPr>
+          <w:p/>
+        </w:tc>
+        <w:tc>
+          <w:tcPr>
+            <w:tcW w:w="1544" w:type="dxa"/>
+          </w:tcPr>
+          <w:p/>
+        </w:tc>
+        <w:tc>
+          <w:tcPr>
+            <w:tcW w:w="1954" w:type="dxa"/>
+          </w:tcPr>
+          <w:p/>
+        </w:tc>
+        <w:tc>
+          <w:tcPr>
+            <w:tcW w:w="2528" w:type="dxa"/>
+          </w:tcPr>
+          <w:p/>
+        </w:tc>
+      </w:tr>
+      <w:tr>
+        <w:tc>
+          <w:tcPr>
+            <w:tcW w:w="1813" w:type="dxa"/>
+          </w:tcPr>
+          <w:p/>
+        </w:tc>
+        <w:tc>
+          <w:tcPr>
+            <w:tcW w:w="2224" w:type="dxa"/>
+          </w:tcPr>
+          <w:p/>
+        </w:tc>
+        <w:tc>
+          <w:tcPr>
+            <w:tcW w:w="1561" w:type="dxa"/>
+          </w:tcPr>
+          <w:p/>
+        </w:tc>
+        <w:tc>
+          <w:tcPr>
+            <w:tcW w:w="1544" w:type="dxa"/>
+          </w:tcPr>
+          <w:p/>
+        </w:tc>
+        <w:tc>
+          <w:tcPr>
+            <w:tcW w:w="1954" w:type="dxa"/>
+          </w:tcPr>
+          <w:p/>
+        </w:tc>
+        <w:tc>
+          <w:tcPr>
+            <w:tcW w:w="2528" w:type="dxa"/>
+          </w:tcPr>
+          <w:p/>
+        </w:tc>
+      </w:tr>
+      <w:tr>
+        <w:tc>
+          <w:tcPr>
+            <w:tcW w:w="1813" w:type="dxa"/>
+          </w:tcPr>
+          <w:p/>
+        </w:tc>
+        <w:tc>
+          <w:tcPr>
+            <w:tcW w:w="2224" w:type="dxa"/>
+          </w:tcPr>
+          <w:p/>
+        </w:tc>
+        <w:tc>
+          <w:tcPr>
+            <w:tcW w:w="1561" w:type="dxa"/>
+          </w:tcPr>
+          <w:p/>
+        </w:tc>
+        <w:tc>
+          <w:tcPr>
+            <w:tcW w:w="1544" w:type="dxa"/>
+          </w:tcPr>
+          <w:p/>
+        </w:tc>
+        <w:tc>
+          <w:tcPr>
+            <w:tcW w:w="1954" w:type="dxa"/>
+          </w:tcPr>
+          <w:p/>
+        </w:tc>
+        <w:tc>
+          <w:tcPr>
+            <w:tcW w:w="2528" w:type="dxa"/>
+          </w:tcPr>
+          <w:p/>
+        </w:tc>
+      </w:tr>
+      <w:tr>
+        <w:tc>
+          <w:tcPr>
+            <w:tcW w:w="1813" w:type="dxa"/>
+          </w:tcPr>
+          <w:p/>
+        </w:tc>
+        <w:tc>
+          <w:tcPr>
+            <w:tcW w:w="2224" w:type="dxa"/>
+          </w:tcPr>
+          <w:p/>
+        </w:tc>
+        <w:tc>
+          <w:tcPr>
+            <w:tcW w:w="1561" w:type="dxa"/>
+          </w:tcPr>
+          <w:p/>
+        </w:tc>
+        <w:tc>
+          <w:tcPr>
+            <w:tcW w:w="1544" w:type="dxa"/>
+          </w:tcPr>
+          <w:p/>
+        </w:tc>
+        <w:tc>
+          <w:tcPr>
+            <w:tcW w:w="1954" w:type="dxa"/>
+          </w:tcPr>
+          <w:p/>
+        </w:tc>
+        <w:tc>
+          <w:tcPr>
+            <w:tcW w:w="2528" w:type="dxa"/>
+          </w:tcPr>
+          <w:p/>
+        </w:tc>
+      </w:tr>
+      <w:tr>
+        <w:tc>
+          <w:tcPr>
+            <w:tcW w:w="1813" w:type="dxa"/>
+          </w:tcPr>
+          <w:p/>
+        </w:tc>
+        <w:tc>
+          <w:tcPr>
+            <w:tcW w:w="2224" w:type="dxa"/>
+          </w:tcPr>
+          <w:p/>
+        </w:tc>
+        <w:tc>
+          <w:tcPr>
+            <w:tcW w:w="1561" w:type="dxa"/>
+          </w:tcPr>
+          <w:p/>
+        </w:tc>
+        <w:tc>
+          <w:tcPr>
+            <w:tcW w:w="1544" w:type="dxa"/>
+          </w:tcPr>
+          <w:p/>
+        </w:tc>
+        <w:tc>
+          <w:tcPr>
+            <w:tcW w:w="1954" w:type="dxa"/>
+          </w:tcPr>
+          <w:p/>
+        </w:tc>
+        <w:tc>
+          <w:tcPr>
+            <w:tcW w:w="2528" w:type="dxa"/>
+          </w:tcPr>
+          <w:p/>
+        </w:tc>
+      </w:tr>
+      <w:tr>
+        <w:tc>
+          <w:tcPr>
+            <w:tcW w:w="1813" w:type="dxa"/>
+          </w:tcPr>
+          <w:p/>
+        </w:tc>
+        <w:tc>
+          <w:tcPr>
+            <w:tcW w:w="2224" w:type="dxa"/>
+          </w:tcPr>
+          <w:p/>
+        </w:tc>
+        <w:tc>
+          <w:tcPr>
+            <w:tcW w:w="1561" w:type="dxa"/>
+          </w:tcPr>
+          <w:p/>
+        </w:tc>
+        <w:tc>
+          <w:tcPr>
+            <w:tcW w:w="1544" w:type="dxa"/>
+          </w:tcPr>
+          <w:p/>
+        </w:tc>
+        <w:tc>
+          <w:tcPr>
+            <w:tcW w:w="1954" w:type="dxa"/>
+          </w:tcPr>
+          <w:p/>
+        </w:tc>
+        <w:tc>
+          <w:tcPr>
+            <w:tcW w:w="2528" w:type="dxa"/>
           </w:tcPr>
           <w:p/>
         </w:tc>
@@ -1485,7 +2734,7 @@
   <w:style w:type="paragraph" w:default="1" w:styleId="Normal">
     <w:name w:val="Normal"/>
     <w:qFormat/>
-    <w:rsid w:val="0011175D"/>
+    <w:rsid w:val="00404ECD"/>
   </w:style>
   <w:style w:type="paragraph" w:styleId="Heading1">
     <w:name w:val="heading 1"/>
@@ -2029,6 +3278,29 @@
       <w:spacing w:after="0" w:line="240" w:lineRule="auto"/>
     </w:pPr>
   </w:style>
+  <w:style w:type="character" w:styleId="Hyperlink">
+    <w:name w:val="Hyperlink"/>
+    <w:basedOn w:val="DefaultParagraphFont"/>
+    <w:uiPriority w:val="99"/>
+    <w:unhideWhenUsed/>
+    <w:rsid w:val="00404ECD"/>
+    <w:rPr>
+      <w:color w:val="467886" w:themeColor="hyperlink"/>
+      <w:u w:val="single"/>
+    </w:rPr>
+  </w:style>
+  <w:style w:type="character" w:styleId="UnresolvedMention">
+    <w:name w:val="Unresolved Mention"/>
+    <w:basedOn w:val="DefaultParagraphFont"/>
+    <w:uiPriority w:val="99"/>
+    <w:semiHidden/>
+    <w:unhideWhenUsed/>
+    <w:rsid w:val="00404ECD"/>
+    <w:rPr>
+      <w:color w:val="605E5C"/>
+      <w:shd w:val="clear" w:color="auto" w:fill="E1DFDD"/>
+    </w:rPr>
+  </w:style>
 </w:styles>
 </file>
 

</xml_diff>

<commit_message>
Refactor booking system: update profile bookings query, improve footer links, and add unfinished page template
</commit_message>
<xml_diff>
--- a/documentation/test log.docx
+++ b/documentation/test log.docx
@@ -1283,13 +1283,7 @@
           </w:tcPr>
           <w:p>
             <w:r>
-              <w:t xml:space="preserve">Testing of navigation links on </w:t>
-            </w:r>
-            <w:r>
-              <w:t>login</w:t>
-            </w:r>
-            <w:r>
-              <w:t xml:space="preserve"> page </w:t>
+              <w:t xml:space="preserve">Testing of navigation links on login page </w:t>
             </w:r>
           </w:p>
         </w:tc>
@@ -1361,13 +1355,7 @@
           </w:tcPr>
           <w:p>
             <w:r>
-              <w:t xml:space="preserve">Testing of navigation links on </w:t>
-            </w:r>
-            <w:r>
-              <w:t>profile</w:t>
-            </w:r>
-            <w:r>
-              <w:t xml:space="preserve"> page </w:t>
+              <w:t xml:space="preserve">Testing of navigation links on profile page </w:t>
             </w:r>
           </w:p>
         </w:tc>
@@ -1429,13 +1417,7 @@
           </w:tcPr>
           <w:p>
             <w:r>
-              <w:t xml:space="preserve">Testing of navigation links on </w:t>
-            </w:r>
-            <w:r>
-              <w:t>testing</w:t>
-            </w:r>
-            <w:r>
-              <w:t xml:space="preserve"> page </w:t>
+              <w:t xml:space="preserve">Testing of navigation links on testing page </w:t>
             </w:r>
           </w:p>
         </w:tc>
@@ -1497,13 +1479,7 @@
           </w:tcPr>
           <w:p>
             <w:r>
-              <w:t xml:space="preserve">Testing of navigation links on </w:t>
-            </w:r>
-            <w:r>
-              <w:t>user info</w:t>
-            </w:r>
-            <w:r>
-              <w:t xml:space="preserve"> page </w:t>
+              <w:t xml:space="preserve">Testing of navigation links on user info page </w:t>
             </w:r>
           </w:p>
         </w:tc>
@@ -1704,10 +1680,7 @@
           </w:tcPr>
           <w:p>
             <w:r>
-              <w:t xml:space="preserve">Couldn’t create account with </w:t>
-            </w:r>
-            <w:r>
-              <w:t>TestPassword12.</w:t>
+              <w:t>Couldn’t create account with TestPassword12.</w:t>
             </w:r>
           </w:p>
         </w:tc>
@@ -1717,13 +1690,7 @@
           </w:tcPr>
           <w:p>
             <w:r>
-              <w:t xml:space="preserve">Needed to use </w:t>
-            </w:r>
-            <w:r>
-              <w:t>TestPassword1</w:t>
-            </w:r>
-            <w:r>
-              <w:t>.</w:t>
+              <w:t>Needed to use TestPassword1.</w:t>
             </w:r>
           </w:p>
         </w:tc>
@@ -1934,10 +1901,7 @@
           </w:tcPr>
           <w:p>
             <w:r>
-              <w:t xml:space="preserve">It did delete successfully </w:t>
-            </w:r>
-            <w:r>
-              <w:t>as I fixed the pathing in main.py</w:t>
+              <w:t>It did delete successfully as I fixed the pathing in main.py</w:t>
             </w:r>
           </w:p>
         </w:tc>
@@ -1947,37 +1911,100 @@
           <w:tcPr>
             <w:tcW w:w="1813" w:type="dxa"/>
           </w:tcPr>
-          <w:p/>
+          <w:p>
+            <w:r>
+              <w:t>Attempt to add “</w:t>
+            </w:r>
+            <w:r>
+              <w:t>booking</w:t>
+            </w:r>
+            <w:r>
+              <w:t>” then delete a “</w:t>
+            </w:r>
+            <w:r>
+              <w:t>booking</w:t>
+            </w:r>
+            <w:r>
+              <w:t>”</w:t>
+            </w:r>
+            <w:r>
+              <w:tab/>
+            </w:r>
+            <w:r>
+              <w:tab/>
+            </w:r>
+            <w:r>
+              <w:tab/>
+            </w:r>
+          </w:p>
         </w:tc>
         <w:tc>
           <w:tcPr>
             <w:tcW w:w="2224" w:type="dxa"/>
           </w:tcPr>
-          <w:p/>
+          <w:p>
+            <w:r>
+              <w:t>Testing</w:t>
+            </w:r>
+            <w:r>
+              <w:t>,</w:t>
+            </w:r>
+            <w:r>
+              <w:t xml:space="preserve"> test, 1</w:t>
+            </w:r>
+          </w:p>
         </w:tc>
         <w:tc>
           <w:tcPr>
             <w:tcW w:w="1561" w:type="dxa"/>
           </w:tcPr>
-          <w:p/>
+          <w:p>
+            <w:r>
+              <w:t>Input testing</w:t>
+            </w:r>
+            <w:r>
+              <w:tab/>
+            </w:r>
+            <w:r>
+              <w:tab/>
+            </w:r>
+          </w:p>
         </w:tc>
         <w:tc>
           <w:tcPr>
             <w:tcW w:w="1544" w:type="dxa"/>
           </w:tcPr>
-          <w:p/>
+          <w:p>
+            <w:r>
+              <w:t xml:space="preserve">Successfully add and delete a </w:t>
+            </w:r>
+            <w:r>
+              <w:t>booking</w:t>
+            </w:r>
+          </w:p>
         </w:tc>
         <w:tc>
           <w:tcPr>
             <w:tcW w:w="1954" w:type="dxa"/>
           </w:tcPr>
-          <w:p/>
+          <w:p>
+            <w:r>
+              <w:t xml:space="preserve">Unable to </w:t>
+            </w:r>
+            <w:r>
+              <w:t>add a booking</w:t>
+            </w:r>
+          </w:p>
         </w:tc>
         <w:tc>
           <w:tcPr>
             <w:tcW w:w="2528" w:type="dxa"/>
           </w:tcPr>
-          <w:p/>
+          <w:p>
+            <w:r>
+              <w:t>Have not updated the booking system to not need courses</w:t>
+            </w:r>
+          </w:p>
         </w:tc>
       </w:tr>
       <w:tr>
@@ -2937,7 +2964,6 @@
   <w:style w:type="character" w:default="1" w:styleId="DefaultParagraphFont">
     <w:name w:val="Default Paragraph Font"/>
     <w:uiPriority w:val="1"/>
-    <w:semiHidden/>
     <w:unhideWhenUsed/>
   </w:style>
   <w:style w:type="table" w:default="1" w:styleId="TableNormal">

</xml_diff>

<commit_message>
updated main file with new function, Successfully delete a booking and updated users.info
</commit_message>
<xml_diff>
--- a/documentation/test log.docx
+++ b/documentation/test log.docx
@@ -1551,17 +1551,17 @@
         <w:tblLook w:val="04A0" w:firstRow="1" w:lastRow="0" w:firstColumn="1" w:lastColumn="0" w:noHBand="0" w:noVBand="1"/>
       </w:tblPr>
       <w:tblGrid>
-        <w:gridCol w:w="1813"/>
+        <w:gridCol w:w="1881"/>
         <w:gridCol w:w="2224"/>
-        <w:gridCol w:w="1561"/>
-        <w:gridCol w:w="1544"/>
+        <w:gridCol w:w="1749"/>
+        <w:gridCol w:w="1531"/>
         <w:gridCol w:w="1954"/>
-        <w:gridCol w:w="2528"/>
+        <w:gridCol w:w="2285"/>
       </w:tblGrid>
       <w:tr>
         <w:tc>
           <w:tcPr>
-            <w:tcW w:w="1813" w:type="dxa"/>
+            <w:tcW w:w="1987" w:type="dxa"/>
           </w:tcPr>
           <w:p>
             <w:r>
@@ -1571,7 +1571,7 @@
         </w:tc>
         <w:tc>
           <w:tcPr>
-            <w:tcW w:w="2224" w:type="dxa"/>
+            <w:tcW w:w="1841" w:type="dxa"/>
           </w:tcPr>
           <w:p>
             <w:r>
@@ -1581,7 +1581,7 @@
         </w:tc>
         <w:tc>
           <w:tcPr>
-            <w:tcW w:w="1561" w:type="dxa"/>
+            <w:tcW w:w="1922" w:type="dxa"/>
           </w:tcPr>
           <w:p>
             <w:r>
@@ -1591,7 +1591,7 @@
         </w:tc>
         <w:tc>
           <w:tcPr>
-            <w:tcW w:w="1544" w:type="dxa"/>
+            <w:tcW w:w="1531" w:type="dxa"/>
           </w:tcPr>
           <w:p>
             <w:r>
@@ -1611,7 +1611,7 @@
         </w:tc>
         <w:tc>
           <w:tcPr>
-            <w:tcW w:w="2528" w:type="dxa"/>
+            <w:tcW w:w="2389" w:type="dxa"/>
           </w:tcPr>
           <w:p>
             <w:r>
@@ -1623,7 +1623,7 @@
       <w:tr>
         <w:tc>
           <w:tcPr>
-            <w:tcW w:w="1813" w:type="dxa"/>
+            <w:tcW w:w="1987" w:type="dxa"/>
           </w:tcPr>
           <w:p>
             <w:r>
@@ -1633,7 +1633,7 @@
         </w:tc>
         <w:tc>
           <w:tcPr>
-            <w:tcW w:w="2224" w:type="dxa"/>
+            <w:tcW w:w="1841" w:type="dxa"/>
           </w:tcPr>
           <w:p>
             <w:r>
@@ -1656,7 +1656,7 @@
         </w:tc>
         <w:tc>
           <w:tcPr>
-            <w:tcW w:w="1561" w:type="dxa"/>
+            <w:tcW w:w="1922" w:type="dxa"/>
           </w:tcPr>
           <w:p>
             <w:r>
@@ -1666,7 +1666,7 @@
         </w:tc>
         <w:tc>
           <w:tcPr>
-            <w:tcW w:w="1544" w:type="dxa"/>
+            <w:tcW w:w="1531" w:type="dxa"/>
           </w:tcPr>
           <w:p>
             <w:r>
@@ -1686,7 +1686,7 @@
         </w:tc>
         <w:tc>
           <w:tcPr>
-            <w:tcW w:w="2528" w:type="dxa"/>
+            <w:tcW w:w="2389" w:type="dxa"/>
           </w:tcPr>
           <w:p>
             <w:r>
@@ -1698,7 +1698,7 @@
       <w:tr>
         <w:tc>
           <w:tcPr>
-            <w:tcW w:w="1813" w:type="dxa"/>
+            <w:tcW w:w="1987" w:type="dxa"/>
           </w:tcPr>
           <w:p>
             <w:r>
@@ -1708,7 +1708,7 @@
         </w:tc>
         <w:tc>
           <w:tcPr>
-            <w:tcW w:w="2224" w:type="dxa"/>
+            <w:tcW w:w="1841" w:type="dxa"/>
           </w:tcPr>
           <w:p>
             <w:r>
@@ -1718,7 +1718,7 @@
         </w:tc>
         <w:tc>
           <w:tcPr>
-            <w:tcW w:w="1561" w:type="dxa"/>
+            <w:tcW w:w="1922" w:type="dxa"/>
           </w:tcPr>
           <w:p>
             <w:r>
@@ -1728,7 +1728,7 @@
         </w:tc>
         <w:tc>
           <w:tcPr>
-            <w:tcW w:w="1544" w:type="dxa"/>
+            <w:tcW w:w="1531" w:type="dxa"/>
           </w:tcPr>
           <w:p>
             <w:r>
@@ -1748,7 +1748,7 @@
         </w:tc>
         <w:tc>
           <w:tcPr>
-            <w:tcW w:w="2528" w:type="dxa"/>
+            <w:tcW w:w="2389" w:type="dxa"/>
           </w:tcPr>
           <w:p>
             <w:r>
@@ -1772,7 +1772,7 @@
       <w:tr>
         <w:tc>
           <w:tcPr>
-            <w:tcW w:w="1813" w:type="dxa"/>
+            <w:tcW w:w="1987" w:type="dxa"/>
           </w:tcPr>
           <w:p>
             <w:r>
@@ -1782,7 +1782,7 @@
         </w:tc>
         <w:tc>
           <w:tcPr>
-            <w:tcW w:w="2224" w:type="dxa"/>
+            <w:tcW w:w="1841" w:type="dxa"/>
           </w:tcPr>
           <w:p>
             <w:r>
@@ -1805,7 +1805,7 @@
         </w:tc>
         <w:tc>
           <w:tcPr>
-            <w:tcW w:w="1561" w:type="dxa"/>
+            <w:tcW w:w="1922" w:type="dxa"/>
           </w:tcPr>
           <w:p>
             <w:r>
@@ -1815,7 +1815,7 @@
         </w:tc>
         <w:tc>
           <w:tcPr>
-            <w:tcW w:w="1544" w:type="dxa"/>
+            <w:tcW w:w="1531" w:type="dxa"/>
           </w:tcPr>
           <w:p>
             <w:r>
@@ -1835,7 +1835,7 @@
         </w:tc>
         <w:tc>
           <w:tcPr>
-            <w:tcW w:w="2528" w:type="dxa"/>
+            <w:tcW w:w="2389" w:type="dxa"/>
           </w:tcPr>
           <w:p>
             <w:r>
@@ -1847,7 +1847,7 @@
       <w:tr>
         <w:tc>
           <w:tcPr>
-            <w:tcW w:w="1813" w:type="dxa"/>
+            <w:tcW w:w="1987" w:type="dxa"/>
           </w:tcPr>
           <w:p>
             <w:r>
@@ -1857,7 +1857,7 @@
         </w:tc>
         <w:tc>
           <w:tcPr>
-            <w:tcW w:w="2224" w:type="dxa"/>
+            <w:tcW w:w="1841" w:type="dxa"/>
           </w:tcPr>
           <w:p>
             <w:r>
@@ -1867,7 +1867,7 @@
         </w:tc>
         <w:tc>
           <w:tcPr>
-            <w:tcW w:w="1561" w:type="dxa"/>
+            <w:tcW w:w="1922" w:type="dxa"/>
           </w:tcPr>
           <w:p>
             <w:r>
@@ -1877,7 +1877,7 @@
         </w:tc>
         <w:tc>
           <w:tcPr>
-            <w:tcW w:w="1544" w:type="dxa"/>
+            <w:tcW w:w="1531" w:type="dxa"/>
           </w:tcPr>
           <w:p>
             <w:r>
@@ -1897,7 +1897,7 @@
         </w:tc>
         <w:tc>
           <w:tcPr>
-            <w:tcW w:w="2528" w:type="dxa"/>
+            <w:tcW w:w="2389" w:type="dxa"/>
           </w:tcPr>
           <w:p>
             <w:r>
@@ -1909,7 +1909,7 @@
       <w:tr>
         <w:tc>
           <w:tcPr>
-            <w:tcW w:w="1813" w:type="dxa"/>
+            <w:tcW w:w="1987" w:type="dxa"/>
           </w:tcPr>
           <w:p>
             <w:r>
@@ -1940,7 +1940,7 @@
         </w:tc>
         <w:tc>
           <w:tcPr>
-            <w:tcW w:w="2224" w:type="dxa"/>
+            <w:tcW w:w="1841" w:type="dxa"/>
           </w:tcPr>
           <w:p>
             <w:r>
@@ -1956,7 +1956,7 @@
         </w:tc>
         <w:tc>
           <w:tcPr>
-            <w:tcW w:w="1561" w:type="dxa"/>
+            <w:tcW w:w="1922" w:type="dxa"/>
           </w:tcPr>
           <w:p>
             <w:r>
@@ -1972,7 +1972,7 @@
         </w:tc>
         <w:tc>
           <w:tcPr>
-            <w:tcW w:w="1544" w:type="dxa"/>
+            <w:tcW w:w="1531" w:type="dxa"/>
           </w:tcPr>
           <w:p>
             <w:r>
@@ -1998,7 +1998,7 @@
         </w:tc>
         <w:tc>
           <w:tcPr>
-            <w:tcW w:w="2528" w:type="dxa"/>
+            <w:tcW w:w="2389" w:type="dxa"/>
           </w:tcPr>
           <w:p>
             <w:r>
@@ -2010,63 +2010,127 @@
       <w:tr>
         <w:tc>
           <w:tcPr>
-            <w:tcW w:w="1813" w:type="dxa"/>
-          </w:tcPr>
-          <w:p/>
-        </w:tc>
-        <w:tc>
-          <w:tcPr>
-            <w:tcW w:w="2224" w:type="dxa"/>
-          </w:tcPr>
-          <w:p/>
-        </w:tc>
-        <w:tc>
-          <w:tcPr>
-            <w:tcW w:w="1561" w:type="dxa"/>
-          </w:tcPr>
-          <w:p/>
-        </w:tc>
-        <w:tc>
-          <w:tcPr>
-            <w:tcW w:w="1544" w:type="dxa"/>
-          </w:tcPr>
-          <w:p/>
+            <w:tcW w:w="1987" w:type="dxa"/>
+          </w:tcPr>
+          <w:p>
+            <w:r>
+              <w:lastRenderedPageBreak/>
+              <w:t>Attempt to</w:t>
+            </w:r>
+            <w:r>
+              <w:t xml:space="preserve"> </w:t>
+            </w:r>
+            <w:r>
+              <w:t>delete a “</w:t>
+            </w:r>
+            <w:r>
+              <w:t>booking</w:t>
+            </w:r>
+            <w:r>
+              <w:t>”</w:t>
+            </w:r>
+          </w:p>
+        </w:tc>
+        <w:tc>
+          <w:tcPr>
+            <w:tcW w:w="1841" w:type="dxa"/>
+          </w:tcPr>
+          <w:p>
+            <w:r>
+              <w:t>1</w:t>
+            </w:r>
+          </w:p>
+        </w:tc>
+        <w:tc>
+          <w:tcPr>
+            <w:tcW w:w="1922" w:type="dxa"/>
+          </w:tcPr>
+          <w:p>
+            <w:r>
+              <w:t>Input testing</w:t>
+            </w:r>
+            <w:r>
+              <w:t>, and data testing</w:t>
+            </w:r>
+            <w:r>
+              <w:tab/>
+            </w:r>
+            <w:r>
+              <w:tab/>
+            </w:r>
+          </w:p>
+        </w:tc>
+        <w:tc>
+          <w:tcPr>
+            <w:tcW w:w="1531" w:type="dxa"/>
+          </w:tcPr>
+          <w:p>
+            <w:r>
+              <w:t xml:space="preserve">Successfully </w:t>
+            </w:r>
+            <w:r>
+              <w:t>delete a “</w:t>
+            </w:r>
+            <w:r>
+              <w:t>booking</w:t>
+            </w:r>
+            <w:r>
+              <w:t>”</w:t>
+            </w:r>
+          </w:p>
         </w:tc>
         <w:tc>
           <w:tcPr>
             <w:tcW w:w="1954" w:type="dxa"/>
           </w:tcPr>
-          <w:p/>
-        </w:tc>
-        <w:tc>
-          <w:tcPr>
-            <w:tcW w:w="2528" w:type="dxa"/>
-          </w:tcPr>
-          <w:p/>
-        </w:tc>
-      </w:tr>
-      <w:tr>
-        <w:tc>
-          <w:tcPr>
-            <w:tcW w:w="1813" w:type="dxa"/>
-          </w:tcPr>
-          <w:p/>
-        </w:tc>
-        <w:tc>
-          <w:tcPr>
-            <w:tcW w:w="2224" w:type="dxa"/>
-          </w:tcPr>
-          <w:p/>
-        </w:tc>
-        <w:tc>
-          <w:tcPr>
-            <w:tcW w:w="1561" w:type="dxa"/>
-          </w:tcPr>
-          <w:p/>
-        </w:tc>
-        <w:tc>
-          <w:tcPr>
-            <w:tcW w:w="1544" w:type="dxa"/>
+          <w:p>
+            <w:r>
+              <w:t xml:space="preserve">Successfully </w:t>
+            </w:r>
+            <w:r>
+              <w:t>delete a “</w:t>
+            </w:r>
+            <w:r>
+              <w:t>booking</w:t>
+            </w:r>
+            <w:r>
+              <w:t>”</w:t>
+            </w:r>
+          </w:p>
+        </w:tc>
+        <w:tc>
+          <w:tcPr>
+            <w:tcW w:w="2389" w:type="dxa"/>
+          </w:tcPr>
+          <w:p>
+            <w:r>
+              <w:t>Updated deleation system for deleting</w:t>
+            </w:r>
+          </w:p>
+        </w:tc>
+      </w:tr>
+      <w:tr>
+        <w:tc>
+          <w:tcPr>
+            <w:tcW w:w="1987" w:type="dxa"/>
+          </w:tcPr>
+          <w:p/>
+        </w:tc>
+        <w:tc>
+          <w:tcPr>
+            <w:tcW w:w="1841" w:type="dxa"/>
+          </w:tcPr>
+          <w:p/>
+        </w:tc>
+        <w:tc>
+          <w:tcPr>
+            <w:tcW w:w="1922" w:type="dxa"/>
+          </w:tcPr>
+          <w:p/>
+        </w:tc>
+        <w:tc>
+          <w:tcPr>
+            <w:tcW w:w="1531" w:type="dxa"/>
           </w:tcPr>
           <w:p/>
         </w:tc>
@@ -2078,33 +2142,33 @@
         </w:tc>
         <w:tc>
           <w:tcPr>
-            <w:tcW w:w="2528" w:type="dxa"/>
-          </w:tcPr>
-          <w:p/>
-        </w:tc>
-      </w:tr>
-      <w:tr>
-        <w:tc>
-          <w:tcPr>
-            <w:tcW w:w="1813" w:type="dxa"/>
-          </w:tcPr>
-          <w:p/>
-        </w:tc>
-        <w:tc>
-          <w:tcPr>
-            <w:tcW w:w="2224" w:type="dxa"/>
-          </w:tcPr>
-          <w:p/>
-        </w:tc>
-        <w:tc>
-          <w:tcPr>
-            <w:tcW w:w="1561" w:type="dxa"/>
-          </w:tcPr>
-          <w:p/>
-        </w:tc>
-        <w:tc>
-          <w:tcPr>
-            <w:tcW w:w="1544" w:type="dxa"/>
+            <w:tcW w:w="2389" w:type="dxa"/>
+          </w:tcPr>
+          <w:p/>
+        </w:tc>
+      </w:tr>
+      <w:tr>
+        <w:tc>
+          <w:tcPr>
+            <w:tcW w:w="1987" w:type="dxa"/>
+          </w:tcPr>
+          <w:p/>
+        </w:tc>
+        <w:tc>
+          <w:tcPr>
+            <w:tcW w:w="1841" w:type="dxa"/>
+          </w:tcPr>
+          <w:p/>
+        </w:tc>
+        <w:tc>
+          <w:tcPr>
+            <w:tcW w:w="1922" w:type="dxa"/>
+          </w:tcPr>
+          <w:p/>
+        </w:tc>
+        <w:tc>
+          <w:tcPr>
+            <w:tcW w:w="1531" w:type="dxa"/>
           </w:tcPr>
           <w:p/>
         </w:tc>
@@ -2116,33 +2180,33 @@
         </w:tc>
         <w:tc>
           <w:tcPr>
-            <w:tcW w:w="2528" w:type="dxa"/>
-          </w:tcPr>
-          <w:p/>
-        </w:tc>
-      </w:tr>
-      <w:tr>
-        <w:tc>
-          <w:tcPr>
-            <w:tcW w:w="1813" w:type="dxa"/>
-          </w:tcPr>
-          <w:p/>
-        </w:tc>
-        <w:tc>
-          <w:tcPr>
-            <w:tcW w:w="2224" w:type="dxa"/>
-          </w:tcPr>
-          <w:p/>
-        </w:tc>
-        <w:tc>
-          <w:tcPr>
-            <w:tcW w:w="1561" w:type="dxa"/>
-          </w:tcPr>
-          <w:p/>
-        </w:tc>
-        <w:tc>
-          <w:tcPr>
-            <w:tcW w:w="1544" w:type="dxa"/>
+            <w:tcW w:w="2389" w:type="dxa"/>
+          </w:tcPr>
+          <w:p/>
+        </w:tc>
+      </w:tr>
+      <w:tr>
+        <w:tc>
+          <w:tcPr>
+            <w:tcW w:w="1987" w:type="dxa"/>
+          </w:tcPr>
+          <w:p/>
+        </w:tc>
+        <w:tc>
+          <w:tcPr>
+            <w:tcW w:w="1841" w:type="dxa"/>
+          </w:tcPr>
+          <w:p/>
+        </w:tc>
+        <w:tc>
+          <w:tcPr>
+            <w:tcW w:w="1922" w:type="dxa"/>
+          </w:tcPr>
+          <w:p/>
+        </w:tc>
+        <w:tc>
+          <w:tcPr>
+            <w:tcW w:w="1531" w:type="dxa"/>
           </w:tcPr>
           <w:p/>
         </w:tc>
@@ -2154,33 +2218,33 @@
         </w:tc>
         <w:tc>
           <w:tcPr>
-            <w:tcW w:w="2528" w:type="dxa"/>
-          </w:tcPr>
-          <w:p/>
-        </w:tc>
-      </w:tr>
-      <w:tr>
-        <w:tc>
-          <w:tcPr>
-            <w:tcW w:w="1813" w:type="dxa"/>
-          </w:tcPr>
-          <w:p/>
-        </w:tc>
-        <w:tc>
-          <w:tcPr>
-            <w:tcW w:w="2224" w:type="dxa"/>
-          </w:tcPr>
-          <w:p/>
-        </w:tc>
-        <w:tc>
-          <w:tcPr>
-            <w:tcW w:w="1561" w:type="dxa"/>
-          </w:tcPr>
-          <w:p/>
-        </w:tc>
-        <w:tc>
-          <w:tcPr>
-            <w:tcW w:w="1544" w:type="dxa"/>
+            <w:tcW w:w="2389" w:type="dxa"/>
+          </w:tcPr>
+          <w:p/>
+        </w:tc>
+      </w:tr>
+      <w:tr>
+        <w:tc>
+          <w:tcPr>
+            <w:tcW w:w="1987" w:type="dxa"/>
+          </w:tcPr>
+          <w:p/>
+        </w:tc>
+        <w:tc>
+          <w:tcPr>
+            <w:tcW w:w="1841" w:type="dxa"/>
+          </w:tcPr>
+          <w:p/>
+        </w:tc>
+        <w:tc>
+          <w:tcPr>
+            <w:tcW w:w="1922" w:type="dxa"/>
+          </w:tcPr>
+          <w:p/>
+        </w:tc>
+        <w:tc>
+          <w:tcPr>
+            <w:tcW w:w="1531" w:type="dxa"/>
           </w:tcPr>
           <w:p/>
         </w:tc>
@@ -2192,33 +2256,33 @@
         </w:tc>
         <w:tc>
           <w:tcPr>
-            <w:tcW w:w="2528" w:type="dxa"/>
-          </w:tcPr>
-          <w:p/>
-        </w:tc>
-      </w:tr>
-      <w:tr>
-        <w:tc>
-          <w:tcPr>
-            <w:tcW w:w="1813" w:type="dxa"/>
-          </w:tcPr>
-          <w:p/>
-        </w:tc>
-        <w:tc>
-          <w:tcPr>
-            <w:tcW w:w="2224" w:type="dxa"/>
-          </w:tcPr>
-          <w:p/>
-        </w:tc>
-        <w:tc>
-          <w:tcPr>
-            <w:tcW w:w="1561" w:type="dxa"/>
-          </w:tcPr>
-          <w:p/>
-        </w:tc>
-        <w:tc>
-          <w:tcPr>
-            <w:tcW w:w="1544" w:type="dxa"/>
+            <w:tcW w:w="2389" w:type="dxa"/>
+          </w:tcPr>
+          <w:p/>
+        </w:tc>
+      </w:tr>
+      <w:tr>
+        <w:tc>
+          <w:tcPr>
+            <w:tcW w:w="1987" w:type="dxa"/>
+          </w:tcPr>
+          <w:p/>
+        </w:tc>
+        <w:tc>
+          <w:tcPr>
+            <w:tcW w:w="1841" w:type="dxa"/>
+          </w:tcPr>
+          <w:p/>
+        </w:tc>
+        <w:tc>
+          <w:tcPr>
+            <w:tcW w:w="1922" w:type="dxa"/>
+          </w:tcPr>
+          <w:p/>
+        </w:tc>
+        <w:tc>
+          <w:tcPr>
+            <w:tcW w:w="1531" w:type="dxa"/>
           </w:tcPr>
           <w:p/>
         </w:tc>
@@ -2230,33 +2294,33 @@
         </w:tc>
         <w:tc>
           <w:tcPr>
-            <w:tcW w:w="2528" w:type="dxa"/>
-          </w:tcPr>
-          <w:p/>
-        </w:tc>
-      </w:tr>
-      <w:tr>
-        <w:tc>
-          <w:tcPr>
-            <w:tcW w:w="1813" w:type="dxa"/>
-          </w:tcPr>
-          <w:p/>
-        </w:tc>
-        <w:tc>
-          <w:tcPr>
-            <w:tcW w:w="2224" w:type="dxa"/>
-          </w:tcPr>
-          <w:p/>
-        </w:tc>
-        <w:tc>
-          <w:tcPr>
-            <w:tcW w:w="1561" w:type="dxa"/>
-          </w:tcPr>
-          <w:p/>
-        </w:tc>
-        <w:tc>
-          <w:tcPr>
-            <w:tcW w:w="1544" w:type="dxa"/>
+            <w:tcW w:w="2389" w:type="dxa"/>
+          </w:tcPr>
+          <w:p/>
+        </w:tc>
+      </w:tr>
+      <w:tr>
+        <w:tc>
+          <w:tcPr>
+            <w:tcW w:w="1987" w:type="dxa"/>
+          </w:tcPr>
+          <w:p/>
+        </w:tc>
+        <w:tc>
+          <w:tcPr>
+            <w:tcW w:w="1841" w:type="dxa"/>
+          </w:tcPr>
+          <w:p/>
+        </w:tc>
+        <w:tc>
+          <w:tcPr>
+            <w:tcW w:w="1922" w:type="dxa"/>
+          </w:tcPr>
+          <w:p/>
+        </w:tc>
+        <w:tc>
+          <w:tcPr>
+            <w:tcW w:w="1531" w:type="dxa"/>
           </w:tcPr>
           <w:p/>
         </w:tc>
@@ -2268,33 +2332,33 @@
         </w:tc>
         <w:tc>
           <w:tcPr>
-            <w:tcW w:w="2528" w:type="dxa"/>
-          </w:tcPr>
-          <w:p/>
-        </w:tc>
-      </w:tr>
-      <w:tr>
-        <w:tc>
-          <w:tcPr>
-            <w:tcW w:w="1813" w:type="dxa"/>
-          </w:tcPr>
-          <w:p/>
-        </w:tc>
-        <w:tc>
-          <w:tcPr>
-            <w:tcW w:w="2224" w:type="dxa"/>
-          </w:tcPr>
-          <w:p/>
-        </w:tc>
-        <w:tc>
-          <w:tcPr>
-            <w:tcW w:w="1561" w:type="dxa"/>
-          </w:tcPr>
-          <w:p/>
-        </w:tc>
-        <w:tc>
-          <w:tcPr>
-            <w:tcW w:w="1544" w:type="dxa"/>
+            <w:tcW w:w="2389" w:type="dxa"/>
+          </w:tcPr>
+          <w:p/>
+        </w:tc>
+      </w:tr>
+      <w:tr>
+        <w:tc>
+          <w:tcPr>
+            <w:tcW w:w="1987" w:type="dxa"/>
+          </w:tcPr>
+          <w:p/>
+        </w:tc>
+        <w:tc>
+          <w:tcPr>
+            <w:tcW w:w="1841" w:type="dxa"/>
+          </w:tcPr>
+          <w:p/>
+        </w:tc>
+        <w:tc>
+          <w:tcPr>
+            <w:tcW w:w="1922" w:type="dxa"/>
+          </w:tcPr>
+          <w:p/>
+        </w:tc>
+        <w:tc>
+          <w:tcPr>
+            <w:tcW w:w="1531" w:type="dxa"/>
           </w:tcPr>
           <w:p/>
         </w:tc>
@@ -2306,33 +2370,33 @@
         </w:tc>
         <w:tc>
           <w:tcPr>
-            <w:tcW w:w="2528" w:type="dxa"/>
-          </w:tcPr>
-          <w:p/>
-        </w:tc>
-      </w:tr>
-      <w:tr>
-        <w:tc>
-          <w:tcPr>
-            <w:tcW w:w="1813" w:type="dxa"/>
-          </w:tcPr>
-          <w:p/>
-        </w:tc>
-        <w:tc>
-          <w:tcPr>
-            <w:tcW w:w="2224" w:type="dxa"/>
-          </w:tcPr>
-          <w:p/>
-        </w:tc>
-        <w:tc>
-          <w:tcPr>
-            <w:tcW w:w="1561" w:type="dxa"/>
-          </w:tcPr>
-          <w:p/>
-        </w:tc>
-        <w:tc>
-          <w:tcPr>
-            <w:tcW w:w="1544" w:type="dxa"/>
+            <w:tcW w:w="2389" w:type="dxa"/>
+          </w:tcPr>
+          <w:p/>
+        </w:tc>
+      </w:tr>
+      <w:tr>
+        <w:tc>
+          <w:tcPr>
+            <w:tcW w:w="1987" w:type="dxa"/>
+          </w:tcPr>
+          <w:p/>
+        </w:tc>
+        <w:tc>
+          <w:tcPr>
+            <w:tcW w:w="1841" w:type="dxa"/>
+          </w:tcPr>
+          <w:p/>
+        </w:tc>
+        <w:tc>
+          <w:tcPr>
+            <w:tcW w:w="1922" w:type="dxa"/>
+          </w:tcPr>
+          <w:p/>
+        </w:tc>
+        <w:tc>
+          <w:tcPr>
+            <w:tcW w:w="1531" w:type="dxa"/>
           </w:tcPr>
           <w:p/>
         </w:tc>
@@ -2344,7 +2408,7 @@
         </w:tc>
         <w:tc>
           <w:tcPr>
-            <w:tcW w:w="2528" w:type="dxa"/>
+            <w:tcW w:w="2389" w:type="dxa"/>
           </w:tcPr>
           <w:p/>
         </w:tc>

</xml_diff>

<commit_message>
Refactor booking system: update table names from courses to articles and assesor, adjust related queries, and improve documentation
</commit_message>
<xml_diff>
--- a/documentation/test log.docx
+++ b/documentation/test log.docx
@@ -1561,7 +1561,7 @@
       <w:tr>
         <w:tc>
           <w:tcPr>
-            <w:tcW w:w="1987" w:type="dxa"/>
+            <w:tcW w:w="1881" w:type="dxa"/>
           </w:tcPr>
           <w:p>
             <w:r>
@@ -1571,7 +1571,7 @@
         </w:tc>
         <w:tc>
           <w:tcPr>
-            <w:tcW w:w="1841" w:type="dxa"/>
+            <w:tcW w:w="2224" w:type="dxa"/>
           </w:tcPr>
           <w:p>
             <w:r>
@@ -1581,7 +1581,7 @@
         </w:tc>
         <w:tc>
           <w:tcPr>
-            <w:tcW w:w="1922" w:type="dxa"/>
+            <w:tcW w:w="1749" w:type="dxa"/>
           </w:tcPr>
           <w:p>
             <w:r>
@@ -1611,7 +1611,7 @@
         </w:tc>
         <w:tc>
           <w:tcPr>
-            <w:tcW w:w="2389" w:type="dxa"/>
+            <w:tcW w:w="2285" w:type="dxa"/>
           </w:tcPr>
           <w:p>
             <w:r>
@@ -1623,7 +1623,7 @@
       <w:tr>
         <w:tc>
           <w:tcPr>
-            <w:tcW w:w="1987" w:type="dxa"/>
+            <w:tcW w:w="1881" w:type="dxa"/>
           </w:tcPr>
           <w:p>
             <w:r>
@@ -1633,7 +1633,7 @@
         </w:tc>
         <w:tc>
           <w:tcPr>
-            <w:tcW w:w="1841" w:type="dxa"/>
+            <w:tcW w:w="2224" w:type="dxa"/>
           </w:tcPr>
           <w:p>
             <w:r>
@@ -1656,7 +1656,7 @@
         </w:tc>
         <w:tc>
           <w:tcPr>
-            <w:tcW w:w="1922" w:type="dxa"/>
+            <w:tcW w:w="1749" w:type="dxa"/>
           </w:tcPr>
           <w:p>
             <w:r>
@@ -1686,7 +1686,7 @@
         </w:tc>
         <w:tc>
           <w:tcPr>
-            <w:tcW w:w="2389" w:type="dxa"/>
+            <w:tcW w:w="2285" w:type="dxa"/>
           </w:tcPr>
           <w:p>
             <w:r>
@@ -1698,7 +1698,7 @@
       <w:tr>
         <w:tc>
           <w:tcPr>
-            <w:tcW w:w="1987" w:type="dxa"/>
+            <w:tcW w:w="1881" w:type="dxa"/>
           </w:tcPr>
           <w:p>
             <w:r>
@@ -1708,7 +1708,7 @@
         </w:tc>
         <w:tc>
           <w:tcPr>
-            <w:tcW w:w="1841" w:type="dxa"/>
+            <w:tcW w:w="2224" w:type="dxa"/>
           </w:tcPr>
           <w:p>
             <w:r>
@@ -1718,7 +1718,7 @@
         </w:tc>
         <w:tc>
           <w:tcPr>
-            <w:tcW w:w="1922" w:type="dxa"/>
+            <w:tcW w:w="1749" w:type="dxa"/>
           </w:tcPr>
           <w:p>
             <w:r>
@@ -1748,7 +1748,7 @@
         </w:tc>
         <w:tc>
           <w:tcPr>
-            <w:tcW w:w="2389" w:type="dxa"/>
+            <w:tcW w:w="2285" w:type="dxa"/>
           </w:tcPr>
           <w:p>
             <w:r>
@@ -1772,7 +1772,7 @@
       <w:tr>
         <w:tc>
           <w:tcPr>
-            <w:tcW w:w="1987" w:type="dxa"/>
+            <w:tcW w:w="1881" w:type="dxa"/>
           </w:tcPr>
           <w:p>
             <w:r>
@@ -1782,7 +1782,7 @@
         </w:tc>
         <w:tc>
           <w:tcPr>
-            <w:tcW w:w="1841" w:type="dxa"/>
+            <w:tcW w:w="2224" w:type="dxa"/>
           </w:tcPr>
           <w:p>
             <w:r>
@@ -1805,7 +1805,7 @@
         </w:tc>
         <w:tc>
           <w:tcPr>
-            <w:tcW w:w="1922" w:type="dxa"/>
+            <w:tcW w:w="1749" w:type="dxa"/>
           </w:tcPr>
           <w:p>
             <w:r>
@@ -1835,7 +1835,7 @@
         </w:tc>
         <w:tc>
           <w:tcPr>
-            <w:tcW w:w="2389" w:type="dxa"/>
+            <w:tcW w:w="2285" w:type="dxa"/>
           </w:tcPr>
           <w:p>
             <w:r>
@@ -1847,7 +1847,7 @@
       <w:tr>
         <w:tc>
           <w:tcPr>
-            <w:tcW w:w="1987" w:type="dxa"/>
+            <w:tcW w:w="1881" w:type="dxa"/>
           </w:tcPr>
           <w:p>
             <w:r>
@@ -1857,7 +1857,7 @@
         </w:tc>
         <w:tc>
           <w:tcPr>
-            <w:tcW w:w="1841" w:type="dxa"/>
+            <w:tcW w:w="2224" w:type="dxa"/>
           </w:tcPr>
           <w:p>
             <w:r>
@@ -1867,7 +1867,7 @@
         </w:tc>
         <w:tc>
           <w:tcPr>
-            <w:tcW w:w="1922" w:type="dxa"/>
+            <w:tcW w:w="1749" w:type="dxa"/>
           </w:tcPr>
           <w:p>
             <w:r>
@@ -1897,7 +1897,7 @@
         </w:tc>
         <w:tc>
           <w:tcPr>
-            <w:tcW w:w="2389" w:type="dxa"/>
+            <w:tcW w:w="2285" w:type="dxa"/>
           </w:tcPr>
           <w:p>
             <w:r>
@@ -1909,7 +1909,7 @@
       <w:tr>
         <w:tc>
           <w:tcPr>
-            <w:tcW w:w="1987" w:type="dxa"/>
+            <w:tcW w:w="1881" w:type="dxa"/>
           </w:tcPr>
           <w:p>
             <w:r>
@@ -1940,7 +1940,7 @@
         </w:tc>
         <w:tc>
           <w:tcPr>
-            <w:tcW w:w="1841" w:type="dxa"/>
+            <w:tcW w:w="2224" w:type="dxa"/>
           </w:tcPr>
           <w:p>
             <w:r>
@@ -1956,7 +1956,7 @@
         </w:tc>
         <w:tc>
           <w:tcPr>
-            <w:tcW w:w="1922" w:type="dxa"/>
+            <w:tcW w:w="1749" w:type="dxa"/>
           </w:tcPr>
           <w:p>
             <w:r>
@@ -1998,7 +1998,7 @@
         </w:tc>
         <w:tc>
           <w:tcPr>
-            <w:tcW w:w="2389" w:type="dxa"/>
+            <w:tcW w:w="2285" w:type="dxa"/>
           </w:tcPr>
           <w:p>
             <w:r>
@@ -2010,7 +2010,7 @@
       <w:tr>
         <w:tc>
           <w:tcPr>
-            <w:tcW w:w="1987" w:type="dxa"/>
+            <w:tcW w:w="1881" w:type="dxa"/>
           </w:tcPr>
           <w:p>
             <w:r>
@@ -2033,7 +2033,7 @@
         </w:tc>
         <w:tc>
           <w:tcPr>
-            <w:tcW w:w="1841" w:type="dxa"/>
+            <w:tcW w:w="2224" w:type="dxa"/>
           </w:tcPr>
           <w:p>
             <w:r>
@@ -2043,7 +2043,7 @@
         </w:tc>
         <w:tc>
           <w:tcPr>
-            <w:tcW w:w="1922" w:type="dxa"/>
+            <w:tcW w:w="1749" w:type="dxa"/>
           </w:tcPr>
           <w:p>
             <w:r>
@@ -2100,69 +2100,138 @@
         </w:tc>
         <w:tc>
           <w:tcPr>
-            <w:tcW w:w="2389" w:type="dxa"/>
-          </w:tcPr>
-          <w:p>
-            <w:r>
-              <w:t>Updated deleation system for deleting</w:t>
-            </w:r>
-          </w:p>
-        </w:tc>
-      </w:tr>
-      <w:tr>
-        <w:tc>
-          <w:tcPr>
-            <w:tcW w:w="1987" w:type="dxa"/>
-          </w:tcPr>
-          <w:p/>
-        </w:tc>
-        <w:tc>
-          <w:tcPr>
-            <w:tcW w:w="1841" w:type="dxa"/>
-          </w:tcPr>
-          <w:p/>
-        </w:tc>
-        <w:tc>
-          <w:tcPr>
-            <w:tcW w:w="1922" w:type="dxa"/>
-          </w:tcPr>
-          <w:p/>
+            <w:tcW w:w="2285" w:type="dxa"/>
+          </w:tcPr>
+          <w:p>
+            <w:r>
+              <w:t>Updated system for deleting</w:t>
+            </w:r>
+          </w:p>
+        </w:tc>
+      </w:tr>
+      <w:tr>
+        <w:tc>
+          <w:tcPr>
+            <w:tcW w:w="1881" w:type="dxa"/>
+          </w:tcPr>
+          <w:p>
+            <w:r>
+              <w:t>Attempt to add “</w:t>
+            </w:r>
+            <w:r>
+              <w:t>booking</w:t>
+            </w:r>
+            <w:r>
+              <w:t>” then delete a “</w:t>
+            </w:r>
+            <w:r>
+              <w:t>booking</w:t>
+            </w:r>
+            <w:r>
+              <w:t>”</w:t>
+            </w:r>
+            <w:r>
+              <w:t xml:space="preserve"> (admin page)</w:t>
+            </w:r>
+            <w:r>
+              <w:tab/>
+            </w:r>
+            <w:r>
+              <w:tab/>
+            </w:r>
+            <w:r>
+              <w:tab/>
+            </w:r>
+          </w:p>
+        </w:tc>
+        <w:tc>
+          <w:tcPr>
+            <w:tcW w:w="2224" w:type="dxa"/>
+          </w:tcPr>
+          <w:p>
+            <w:r>
+              <w:t>Testing</w:t>
+            </w:r>
+            <w:r>
+              <w:t>,</w:t>
+            </w:r>
+            <w:r>
+              <w:t xml:space="preserve"> </w:t>
+            </w:r>
+            <w:r>
+              <w:t>16/01/2025</w:t>
+            </w:r>
+            <w:r>
+              <w:t xml:space="preserve">, </w:t>
+            </w:r>
+            <w:r>
+              <w:t>9:34</w:t>
+            </w:r>
+          </w:p>
+        </w:tc>
+        <w:tc>
+          <w:tcPr>
+            <w:tcW w:w="1749" w:type="dxa"/>
+          </w:tcPr>
+          <w:p>
+            <w:r>
+              <w:t>Input testing</w:t>
+            </w:r>
+            <w:r>
+              <w:tab/>
+            </w:r>
+            <w:r>
+              <w:tab/>
+            </w:r>
+          </w:p>
         </w:tc>
         <w:tc>
           <w:tcPr>
             <w:tcW w:w="1531" w:type="dxa"/>
           </w:tcPr>
-          <w:p/>
+          <w:p>
+            <w:r>
+              <w:t>Successfully add and delete a booking</w:t>
+            </w:r>
+          </w:p>
         </w:tc>
         <w:tc>
           <w:tcPr>
             <w:tcW w:w="1954" w:type="dxa"/>
           </w:tcPr>
-          <w:p/>
-        </w:tc>
-        <w:tc>
-          <w:tcPr>
-            <w:tcW w:w="2389" w:type="dxa"/>
-          </w:tcPr>
-          <w:p/>
-        </w:tc>
-      </w:tr>
-      <w:tr>
-        <w:tc>
-          <w:tcPr>
-            <w:tcW w:w="1987" w:type="dxa"/>
-          </w:tcPr>
-          <w:p/>
-        </w:tc>
-        <w:tc>
-          <w:tcPr>
-            <w:tcW w:w="1841" w:type="dxa"/>
-          </w:tcPr>
-          <w:p/>
-        </w:tc>
-        <w:tc>
-          <w:tcPr>
-            <w:tcW w:w="1922" w:type="dxa"/>
+          <w:p>
+            <w:r>
+              <w:t>Successfully add and delete a booking</w:t>
+            </w:r>
+          </w:p>
+        </w:tc>
+        <w:tc>
+          <w:tcPr>
+            <w:tcW w:w="2285" w:type="dxa"/>
+          </w:tcPr>
+          <w:p>
+            <w:r>
+              <w:t>Able to add and delete booked assessments on the admin page</w:t>
+            </w:r>
+          </w:p>
+        </w:tc>
+      </w:tr>
+      <w:tr>
+        <w:tc>
+          <w:tcPr>
+            <w:tcW w:w="1881" w:type="dxa"/>
+          </w:tcPr>
+          <w:p/>
+        </w:tc>
+        <w:tc>
+          <w:tcPr>
+            <w:tcW w:w="2224" w:type="dxa"/>
+          </w:tcPr>
+          <w:p/>
+        </w:tc>
+        <w:tc>
+          <w:tcPr>
+            <w:tcW w:w="1749" w:type="dxa"/>
           </w:tcPr>
           <w:p/>
         </w:tc>
@@ -2180,27 +2249,27 @@
         </w:tc>
         <w:tc>
           <w:tcPr>
-            <w:tcW w:w="2389" w:type="dxa"/>
-          </w:tcPr>
-          <w:p/>
-        </w:tc>
-      </w:tr>
-      <w:tr>
-        <w:tc>
-          <w:tcPr>
-            <w:tcW w:w="1987" w:type="dxa"/>
-          </w:tcPr>
-          <w:p/>
-        </w:tc>
-        <w:tc>
-          <w:tcPr>
-            <w:tcW w:w="1841" w:type="dxa"/>
-          </w:tcPr>
-          <w:p/>
-        </w:tc>
-        <w:tc>
-          <w:tcPr>
-            <w:tcW w:w="1922" w:type="dxa"/>
+            <w:tcW w:w="2285" w:type="dxa"/>
+          </w:tcPr>
+          <w:p/>
+        </w:tc>
+      </w:tr>
+      <w:tr>
+        <w:tc>
+          <w:tcPr>
+            <w:tcW w:w="1881" w:type="dxa"/>
+          </w:tcPr>
+          <w:p/>
+        </w:tc>
+        <w:tc>
+          <w:tcPr>
+            <w:tcW w:w="2224" w:type="dxa"/>
+          </w:tcPr>
+          <w:p/>
+        </w:tc>
+        <w:tc>
+          <w:tcPr>
+            <w:tcW w:w="1749" w:type="dxa"/>
           </w:tcPr>
           <w:p/>
         </w:tc>
@@ -2218,27 +2287,27 @@
         </w:tc>
         <w:tc>
           <w:tcPr>
-            <w:tcW w:w="2389" w:type="dxa"/>
-          </w:tcPr>
-          <w:p/>
-        </w:tc>
-      </w:tr>
-      <w:tr>
-        <w:tc>
-          <w:tcPr>
-            <w:tcW w:w="1987" w:type="dxa"/>
-          </w:tcPr>
-          <w:p/>
-        </w:tc>
-        <w:tc>
-          <w:tcPr>
-            <w:tcW w:w="1841" w:type="dxa"/>
-          </w:tcPr>
-          <w:p/>
-        </w:tc>
-        <w:tc>
-          <w:tcPr>
-            <w:tcW w:w="1922" w:type="dxa"/>
+            <w:tcW w:w="2285" w:type="dxa"/>
+          </w:tcPr>
+          <w:p/>
+        </w:tc>
+      </w:tr>
+      <w:tr>
+        <w:tc>
+          <w:tcPr>
+            <w:tcW w:w="1881" w:type="dxa"/>
+          </w:tcPr>
+          <w:p/>
+        </w:tc>
+        <w:tc>
+          <w:tcPr>
+            <w:tcW w:w="2224" w:type="dxa"/>
+          </w:tcPr>
+          <w:p/>
+        </w:tc>
+        <w:tc>
+          <w:tcPr>
+            <w:tcW w:w="1749" w:type="dxa"/>
           </w:tcPr>
           <w:p/>
         </w:tc>
@@ -2256,27 +2325,27 @@
         </w:tc>
         <w:tc>
           <w:tcPr>
-            <w:tcW w:w="2389" w:type="dxa"/>
-          </w:tcPr>
-          <w:p/>
-        </w:tc>
-      </w:tr>
-      <w:tr>
-        <w:tc>
-          <w:tcPr>
-            <w:tcW w:w="1987" w:type="dxa"/>
-          </w:tcPr>
-          <w:p/>
-        </w:tc>
-        <w:tc>
-          <w:tcPr>
-            <w:tcW w:w="1841" w:type="dxa"/>
-          </w:tcPr>
-          <w:p/>
-        </w:tc>
-        <w:tc>
-          <w:tcPr>
-            <w:tcW w:w="1922" w:type="dxa"/>
+            <w:tcW w:w="2285" w:type="dxa"/>
+          </w:tcPr>
+          <w:p/>
+        </w:tc>
+      </w:tr>
+      <w:tr>
+        <w:tc>
+          <w:tcPr>
+            <w:tcW w:w="1881" w:type="dxa"/>
+          </w:tcPr>
+          <w:p/>
+        </w:tc>
+        <w:tc>
+          <w:tcPr>
+            <w:tcW w:w="2224" w:type="dxa"/>
+          </w:tcPr>
+          <w:p/>
+        </w:tc>
+        <w:tc>
+          <w:tcPr>
+            <w:tcW w:w="1749" w:type="dxa"/>
           </w:tcPr>
           <w:p/>
         </w:tc>
@@ -2294,27 +2363,27 @@
         </w:tc>
         <w:tc>
           <w:tcPr>
-            <w:tcW w:w="2389" w:type="dxa"/>
-          </w:tcPr>
-          <w:p/>
-        </w:tc>
-      </w:tr>
-      <w:tr>
-        <w:tc>
-          <w:tcPr>
-            <w:tcW w:w="1987" w:type="dxa"/>
-          </w:tcPr>
-          <w:p/>
-        </w:tc>
-        <w:tc>
-          <w:tcPr>
-            <w:tcW w:w="1841" w:type="dxa"/>
-          </w:tcPr>
-          <w:p/>
-        </w:tc>
-        <w:tc>
-          <w:tcPr>
-            <w:tcW w:w="1922" w:type="dxa"/>
+            <w:tcW w:w="2285" w:type="dxa"/>
+          </w:tcPr>
+          <w:p/>
+        </w:tc>
+      </w:tr>
+      <w:tr>
+        <w:tc>
+          <w:tcPr>
+            <w:tcW w:w="1881" w:type="dxa"/>
+          </w:tcPr>
+          <w:p/>
+        </w:tc>
+        <w:tc>
+          <w:tcPr>
+            <w:tcW w:w="2224" w:type="dxa"/>
+          </w:tcPr>
+          <w:p/>
+        </w:tc>
+        <w:tc>
+          <w:tcPr>
+            <w:tcW w:w="1749" w:type="dxa"/>
           </w:tcPr>
           <w:p/>
         </w:tc>
@@ -2332,27 +2401,27 @@
         </w:tc>
         <w:tc>
           <w:tcPr>
-            <w:tcW w:w="2389" w:type="dxa"/>
-          </w:tcPr>
-          <w:p/>
-        </w:tc>
-      </w:tr>
-      <w:tr>
-        <w:tc>
-          <w:tcPr>
-            <w:tcW w:w="1987" w:type="dxa"/>
-          </w:tcPr>
-          <w:p/>
-        </w:tc>
-        <w:tc>
-          <w:tcPr>
-            <w:tcW w:w="1841" w:type="dxa"/>
-          </w:tcPr>
-          <w:p/>
-        </w:tc>
-        <w:tc>
-          <w:tcPr>
-            <w:tcW w:w="1922" w:type="dxa"/>
+            <w:tcW w:w="2285" w:type="dxa"/>
+          </w:tcPr>
+          <w:p/>
+        </w:tc>
+      </w:tr>
+      <w:tr>
+        <w:tc>
+          <w:tcPr>
+            <w:tcW w:w="1881" w:type="dxa"/>
+          </w:tcPr>
+          <w:p/>
+        </w:tc>
+        <w:tc>
+          <w:tcPr>
+            <w:tcW w:w="2224" w:type="dxa"/>
+          </w:tcPr>
+          <w:p/>
+        </w:tc>
+        <w:tc>
+          <w:tcPr>
+            <w:tcW w:w="1749" w:type="dxa"/>
           </w:tcPr>
           <w:p/>
         </w:tc>
@@ -2370,27 +2439,27 @@
         </w:tc>
         <w:tc>
           <w:tcPr>
-            <w:tcW w:w="2389" w:type="dxa"/>
-          </w:tcPr>
-          <w:p/>
-        </w:tc>
-      </w:tr>
-      <w:tr>
-        <w:tc>
-          <w:tcPr>
-            <w:tcW w:w="1987" w:type="dxa"/>
-          </w:tcPr>
-          <w:p/>
-        </w:tc>
-        <w:tc>
-          <w:tcPr>
-            <w:tcW w:w="1841" w:type="dxa"/>
-          </w:tcPr>
-          <w:p/>
-        </w:tc>
-        <w:tc>
-          <w:tcPr>
-            <w:tcW w:w="1922" w:type="dxa"/>
+            <w:tcW w:w="2285" w:type="dxa"/>
+          </w:tcPr>
+          <w:p/>
+        </w:tc>
+      </w:tr>
+      <w:tr>
+        <w:tc>
+          <w:tcPr>
+            <w:tcW w:w="1881" w:type="dxa"/>
+          </w:tcPr>
+          <w:p/>
+        </w:tc>
+        <w:tc>
+          <w:tcPr>
+            <w:tcW w:w="2224" w:type="dxa"/>
+          </w:tcPr>
+          <w:p/>
+        </w:tc>
+        <w:tc>
+          <w:tcPr>
+            <w:tcW w:w="1749" w:type="dxa"/>
           </w:tcPr>
           <w:p/>
         </w:tc>
@@ -2408,7 +2477,7 @@
         </w:tc>
         <w:tc>
           <w:tcPr>
-            <w:tcW w:w="2389" w:type="dxa"/>
+            <w:tcW w:w="2285" w:type="dxa"/>
           </w:tcPr>
           <w:p/>
         </w:tc>

</xml_diff>

<commit_message>
Add AI response handling and functionality in main.py/index
</commit_message>
<xml_diff>
--- a/documentation/test log.docx
+++ b/documentation/test log.docx
@@ -1989,10 +1989,7 @@
           </w:tcPr>
           <w:p>
             <w:r>
-              <w:t xml:space="preserve">Unable to </w:t>
-            </w:r>
-            <w:r>
-              <w:t>add a booking</w:t>
+              <w:t>Unable to add a booking</w:t>
             </w:r>
           </w:p>
         </w:tc>
@@ -2015,19 +2012,209 @@
           <w:p>
             <w:r>
               <w:lastRenderedPageBreak/>
-              <w:t>Attempt to</w:t>
+              <w:t>Attempt to delete a “</w:t>
+            </w:r>
+            <w:r>
+              <w:t>booking</w:t>
+            </w:r>
+            <w:r>
+              <w:t>”</w:t>
+            </w:r>
+          </w:p>
+        </w:tc>
+        <w:tc>
+          <w:tcPr>
+            <w:tcW w:w="2224" w:type="dxa"/>
+          </w:tcPr>
+          <w:p>
+            <w:r>
+              <w:t>1</w:t>
+            </w:r>
+          </w:p>
+        </w:tc>
+        <w:tc>
+          <w:tcPr>
+            <w:tcW w:w="1749" w:type="dxa"/>
+          </w:tcPr>
+          <w:p>
+            <w:r>
+              <w:t>Input testing</w:t>
+            </w:r>
+            <w:r>
+              <w:t>, and data testing</w:t>
+            </w:r>
+            <w:r>
+              <w:tab/>
+            </w:r>
+            <w:r>
+              <w:tab/>
+            </w:r>
+          </w:p>
+        </w:tc>
+        <w:tc>
+          <w:tcPr>
+            <w:tcW w:w="1531" w:type="dxa"/>
+          </w:tcPr>
+          <w:p>
+            <w:r>
+              <w:t xml:space="preserve">Successfully </w:t>
+            </w:r>
+            <w:r>
+              <w:t>delete a “</w:t>
+            </w:r>
+            <w:r>
+              <w:t>booking</w:t>
+            </w:r>
+            <w:r>
+              <w:t>”</w:t>
+            </w:r>
+          </w:p>
+        </w:tc>
+        <w:tc>
+          <w:tcPr>
+            <w:tcW w:w="1954" w:type="dxa"/>
+          </w:tcPr>
+          <w:p>
+            <w:r>
+              <w:t xml:space="preserve">Successfully </w:t>
+            </w:r>
+            <w:r>
+              <w:t>delete a “</w:t>
+            </w:r>
+            <w:r>
+              <w:t>booking</w:t>
+            </w:r>
+            <w:r>
+              <w:t>”</w:t>
+            </w:r>
+          </w:p>
+        </w:tc>
+        <w:tc>
+          <w:tcPr>
+            <w:tcW w:w="2285" w:type="dxa"/>
+          </w:tcPr>
+          <w:p>
+            <w:r>
+              <w:t>Updated system for deleting</w:t>
+            </w:r>
+          </w:p>
+        </w:tc>
+      </w:tr>
+      <w:tr>
+        <w:tc>
+          <w:tcPr>
+            <w:tcW w:w="1881" w:type="dxa"/>
+          </w:tcPr>
+          <w:p>
+            <w:r>
+              <w:t>Attempt to add “</w:t>
+            </w:r>
+            <w:r>
+              <w:t>booking</w:t>
+            </w:r>
+            <w:r>
+              <w:t>” then delete a “</w:t>
+            </w:r>
+            <w:r>
+              <w:t>booking</w:t>
+            </w:r>
+            <w:r>
+              <w:t>”</w:t>
+            </w:r>
+            <w:r>
+              <w:t xml:space="preserve"> (admin page)</w:t>
+            </w:r>
+            <w:r>
+              <w:tab/>
+            </w:r>
+            <w:r>
+              <w:tab/>
+            </w:r>
+            <w:r>
+              <w:tab/>
+            </w:r>
+          </w:p>
+        </w:tc>
+        <w:tc>
+          <w:tcPr>
+            <w:tcW w:w="2224" w:type="dxa"/>
+          </w:tcPr>
+          <w:p>
+            <w:r>
+              <w:t>Testing</w:t>
+            </w:r>
+            <w:r>
+              <w:t>,</w:t>
             </w:r>
             <w:r>
               <w:t xml:space="preserve"> </w:t>
             </w:r>
             <w:r>
-              <w:t>delete a “</w:t>
-            </w:r>
-            <w:r>
-              <w:t>booking</w:t>
-            </w:r>
-            <w:r>
-              <w:t>”</w:t>
+              <w:t>16/01/2025</w:t>
+            </w:r>
+            <w:r>
+              <w:t xml:space="preserve">, </w:t>
+            </w:r>
+            <w:r>
+              <w:t>9:34</w:t>
+            </w:r>
+          </w:p>
+        </w:tc>
+        <w:tc>
+          <w:tcPr>
+            <w:tcW w:w="1749" w:type="dxa"/>
+          </w:tcPr>
+          <w:p>
+            <w:r>
+              <w:t>Input testing</w:t>
+            </w:r>
+            <w:r>
+              <w:tab/>
+            </w:r>
+            <w:r>
+              <w:tab/>
+            </w:r>
+          </w:p>
+        </w:tc>
+        <w:tc>
+          <w:tcPr>
+            <w:tcW w:w="1531" w:type="dxa"/>
+          </w:tcPr>
+          <w:p>
+            <w:r>
+              <w:t>Successfully add and delete a booking</w:t>
+            </w:r>
+          </w:p>
+        </w:tc>
+        <w:tc>
+          <w:tcPr>
+            <w:tcW w:w="1954" w:type="dxa"/>
+          </w:tcPr>
+          <w:p>
+            <w:r>
+              <w:t>Successfully add and delete a booking</w:t>
+            </w:r>
+          </w:p>
+        </w:tc>
+        <w:tc>
+          <w:tcPr>
+            <w:tcW w:w="2285" w:type="dxa"/>
+          </w:tcPr>
+          <w:p>
+            <w:r>
+              <w:t>Able to add and delete booked assessments on the admin page</w:t>
+            </w:r>
+          </w:p>
+        </w:tc>
+      </w:tr>
+      <w:tr>
+        <w:tc>
+          <w:tcPr>
+            <w:tcW w:w="1881" w:type="dxa"/>
+          </w:tcPr>
+          <w:p>
+            <w:r>
+              <w:t>Attempt to add “booking”</w:t>
             </w:r>
           </w:p>
         </w:tc>
@@ -2037,7 +2224,7 @@
           </w:tcPr>
           <w:p>
             <w:r>
-              <w:t>1</w:t>
+              <w:t>Toby Mathews, 21/01/2025</w:t>
             </w:r>
           </w:p>
         </w:tc>
@@ -2049,15 +2236,6 @@
             <w:r>
               <w:t>Input testing</w:t>
             </w:r>
-            <w:r>
-              <w:t>, and data testing</w:t>
-            </w:r>
-            <w:r>
-              <w:tab/>
-            </w:r>
-            <w:r>
-              <w:tab/>
-            </w:r>
           </w:p>
         </w:tc>
         <w:tc>
@@ -2066,16 +2244,7 @@
           </w:tcPr>
           <w:p>
             <w:r>
-              <w:t xml:space="preserve">Successfully </w:t>
-            </w:r>
-            <w:r>
-              <w:t>delete a “</w:t>
-            </w:r>
-            <w:r>
-              <w:t>booking</w:t>
-            </w:r>
-            <w:r>
-              <w:t>”</w:t>
+              <w:t>Successfully add a booking</w:t>
             </w:r>
           </w:p>
         </w:tc>
@@ -2085,16 +2254,7 @@
           </w:tcPr>
           <w:p>
             <w:r>
-              <w:t xml:space="preserve">Successfully </w:t>
-            </w:r>
-            <w:r>
-              <w:t>delete a “</w:t>
-            </w:r>
-            <w:r>
-              <w:t>booking</w:t>
-            </w:r>
-            <w:r>
-              <w:t>”</w:t>
+              <w:t>Successfully add a booking</w:t>
             </w:r>
           </w:p>
         </w:tc>
@@ -2102,11 +2262,7 @@
           <w:tcPr>
             <w:tcW w:w="2285" w:type="dxa"/>
           </w:tcPr>
-          <w:p>
-            <w:r>
-              <w:t>Updated system for deleting</w:t>
-            </w:r>
-          </w:p>
+          <w:p/>
         </w:tc>
       </w:tr>
       <w:tr>
@@ -2116,31 +2272,7 @@
           </w:tcPr>
           <w:p>
             <w:r>
-              <w:t>Attempt to add “</w:t>
-            </w:r>
-            <w:r>
-              <w:t>booking</w:t>
-            </w:r>
-            <w:r>
-              <w:t>” then delete a “</w:t>
-            </w:r>
-            <w:r>
-              <w:t>booking</w:t>
-            </w:r>
-            <w:r>
-              <w:t>”</w:t>
-            </w:r>
-            <w:r>
-              <w:t xml:space="preserve"> (admin page)</w:t>
-            </w:r>
-            <w:r>
-              <w:tab/>
-            </w:r>
-            <w:r>
-              <w:tab/>
-            </w:r>
-            <w:r>
-              <w:tab/>
+              <w:t xml:space="preserve">Ask ai question </w:t>
             </w:r>
           </w:p>
         </w:tc>
@@ -2149,23 +2281,13 @@
             <w:tcW w:w="2224" w:type="dxa"/>
           </w:tcPr>
           <w:p>
-            <w:r>
-              <w:t>Testing</w:t>
-            </w:r>
-            <w:r>
-              <w:t>,</w:t>
-            </w:r>
-            <w:r>
-              <w:t xml:space="preserve"> </w:t>
-            </w:r>
-            <w:r>
-              <w:t>16/01/2025</w:t>
-            </w:r>
-            <w:r>
-              <w:t xml:space="preserve">, </w:t>
-            </w:r>
-            <w:r>
-              <w:t>9:34</w:t>
+            <w:proofErr w:type="spellStart"/>
+            <w:r>
+              <w:t>im</w:t>
+            </w:r>
+            <w:proofErr w:type="spellEnd"/>
+            <w:r>
+              <w:t xml:space="preserve"> sufffering for hypothermia</w:t>
             </w:r>
           </w:p>
         </w:tc>
@@ -2177,12 +2299,6 @@
             <w:r>
               <w:t>Input testing</w:t>
             </w:r>
-            <w:r>
-              <w:tab/>
-            </w:r>
-            <w:r>
-              <w:tab/>
-            </w:r>
           </w:p>
         </w:tc>
         <w:tc>
@@ -2191,7 +2307,10 @@
           </w:tcPr>
           <w:p>
             <w:r>
-              <w:t>Successfully add and delete a booking</w:t>
+              <w:t>Successfull</w:t>
+            </w:r>
+            <w:r>
+              <w:t>y get a reasonable response</w:t>
             </w:r>
           </w:p>
         </w:tc>
@@ -2201,7 +2320,10 @@
           </w:tcPr>
           <w:p>
             <w:r>
-              <w:t>Successfully add and delete a booking</w:t>
+              <w:t>Successfull</w:t>
+            </w:r>
+            <w:r>
+              <w:t>y get a reasonable response</w:t>
             </w:r>
           </w:p>
         </w:tc>
@@ -2211,7 +2333,7 @@
           </w:tcPr>
           <w:p>
             <w:r>
-              <w:t>Able to add and delete booked assessments on the admin page</w:t>
+              <w:t>Has issue trying to emphasis the words with the ** method will fix</w:t>
             </w:r>
           </w:p>
         </w:tc>
@@ -2221,101 +2343,53 @@
           <w:tcPr>
             <w:tcW w:w="1881" w:type="dxa"/>
           </w:tcPr>
+          <w:p>
+            <w:r>
+              <w:t xml:space="preserve">Test ai </w:t>
+            </w:r>
+            <w:proofErr w:type="spellStart"/>
+            <w:r>
+              <w:t>resoponse</w:t>
+            </w:r>
+            <w:proofErr w:type="spellEnd"/>
+          </w:p>
+        </w:tc>
+        <w:tc>
+          <w:tcPr>
+            <w:tcW w:w="2224" w:type="dxa"/>
+          </w:tcPr>
+          <w:p>
+            <w:proofErr w:type="spellStart"/>
+            <w:r>
+              <w:t>im</w:t>
+            </w:r>
+            <w:proofErr w:type="spellEnd"/>
+            <w:r>
+              <w:t xml:space="preserve"> sufffering for hypothermia</w:t>
+            </w:r>
+          </w:p>
+        </w:tc>
+        <w:tc>
+          <w:tcPr>
+            <w:tcW w:w="1749" w:type="dxa"/>
+          </w:tcPr>
           <w:p/>
         </w:tc>
         <w:tc>
           <w:tcPr>
-            <w:tcW w:w="2224" w:type="dxa"/>
-          </w:tcPr>
-          <w:p/>
-        </w:tc>
-        <w:tc>
-          <w:tcPr>
-            <w:tcW w:w="1749" w:type="dxa"/>
-          </w:tcPr>
-          <w:p/>
-        </w:tc>
-        <w:tc>
-          <w:tcPr>
             <w:tcW w:w="1531" w:type="dxa"/>
           </w:tcPr>
-          <w:p/>
-        </w:tc>
-        <w:tc>
-          <w:tcPr>
-            <w:tcW w:w="1954" w:type="dxa"/>
-          </w:tcPr>
-          <w:p/>
-        </w:tc>
-        <w:tc>
-          <w:tcPr>
-            <w:tcW w:w="2285" w:type="dxa"/>
-          </w:tcPr>
-          <w:p/>
-        </w:tc>
-      </w:tr>
-      <w:tr>
-        <w:tc>
-          <w:tcPr>
-            <w:tcW w:w="1881" w:type="dxa"/>
-          </w:tcPr>
-          <w:p/>
-        </w:tc>
-        <w:tc>
-          <w:tcPr>
-            <w:tcW w:w="2224" w:type="dxa"/>
-          </w:tcPr>
-          <w:p/>
-        </w:tc>
-        <w:tc>
-          <w:tcPr>
-            <w:tcW w:w="1749" w:type="dxa"/>
-          </w:tcPr>
-          <w:p/>
-        </w:tc>
-        <w:tc>
-          <w:tcPr>
-            <w:tcW w:w="1531" w:type="dxa"/>
-          </w:tcPr>
-          <w:p/>
-        </w:tc>
-        <w:tc>
-          <w:tcPr>
-            <w:tcW w:w="1954" w:type="dxa"/>
-          </w:tcPr>
-          <w:p/>
-        </w:tc>
-        <w:tc>
-          <w:tcPr>
-            <w:tcW w:w="2285" w:type="dxa"/>
-          </w:tcPr>
-          <w:p/>
-        </w:tc>
-      </w:tr>
-      <w:tr>
-        <w:tc>
-          <w:tcPr>
-            <w:tcW w:w="1881" w:type="dxa"/>
-          </w:tcPr>
-          <w:p/>
-        </w:tc>
-        <w:tc>
-          <w:tcPr>
-            <w:tcW w:w="2224" w:type="dxa"/>
-          </w:tcPr>
-          <w:p/>
-        </w:tc>
-        <w:tc>
-          <w:tcPr>
-            <w:tcW w:w="1749" w:type="dxa"/>
-          </w:tcPr>
-          <w:p/>
-        </w:tc>
-        <w:tc>
-          <w:tcPr>
-            <w:tcW w:w="1531" w:type="dxa"/>
-          </w:tcPr>
-          <w:p/>
+          <w:p>
+            <w:r>
+              <w:t>Successfull</w:t>
+            </w:r>
+            <w:r>
+              <w:t>y get a reasonable response</w:t>
+            </w:r>
+            <w:r>
+              <w:t xml:space="preserve"> without ** </w:t>
+            </w:r>
+          </w:p>
         </w:tc>
         <w:tc>
           <w:tcPr>
@@ -3097,6 +3171,7 @@
   <w:style w:type="character" w:default="1" w:styleId="DefaultParagraphFont">
     <w:name w:val="Default Paragraph Font"/>
     <w:uiPriority w:val="1"/>
+    <w:semiHidden/>
     <w:unhideWhenUsed/>
   </w:style>
   <w:style w:type="table" w:default="1" w:styleId="TableNormal">

</xml_diff>

<commit_message>
Add weather and AI response handling: implement weather data fetching, enhance AI interaction, and improve response formatting
</commit_message>
<xml_diff>
--- a/documentation/test log.docx
+++ b/documentation/test log.docx
@@ -1546,22 +1546,23 @@
     <w:tbl>
       <w:tblPr>
         <w:tblStyle w:val="TableGrid"/>
-        <w:tblW w:w="11624" w:type="dxa"/>
+        <w:tblW w:w="11482" w:type="dxa"/>
         <w:tblInd w:w="-1281" w:type="dxa"/>
+        <w:tblLayout w:type="fixed"/>
         <w:tblLook w:val="04A0" w:firstRow="1" w:lastRow="0" w:firstColumn="1" w:lastColumn="0" w:noHBand="0" w:noVBand="1"/>
       </w:tblPr>
       <w:tblGrid>
-        <w:gridCol w:w="1881"/>
-        <w:gridCol w:w="2224"/>
-        <w:gridCol w:w="1749"/>
-        <w:gridCol w:w="1531"/>
-        <w:gridCol w:w="1954"/>
-        <w:gridCol w:w="2285"/>
+        <w:gridCol w:w="1276"/>
+        <w:gridCol w:w="1560"/>
+        <w:gridCol w:w="1275"/>
+        <w:gridCol w:w="2051"/>
+        <w:gridCol w:w="1351"/>
+        <w:gridCol w:w="3969"/>
       </w:tblGrid>
       <w:tr>
         <w:tc>
           <w:tcPr>
-            <w:tcW w:w="1881" w:type="dxa"/>
+            <w:tcW w:w="1276" w:type="dxa"/>
           </w:tcPr>
           <w:p>
             <w:r>
@@ -1571,7 +1572,7 @@
         </w:tc>
         <w:tc>
           <w:tcPr>
-            <w:tcW w:w="2224" w:type="dxa"/>
+            <w:tcW w:w="1560" w:type="dxa"/>
           </w:tcPr>
           <w:p>
             <w:r>
@@ -1581,7 +1582,7 @@
         </w:tc>
         <w:tc>
           <w:tcPr>
-            <w:tcW w:w="1749" w:type="dxa"/>
+            <w:tcW w:w="1275" w:type="dxa"/>
           </w:tcPr>
           <w:p>
             <w:r>
@@ -1591,7 +1592,7 @@
         </w:tc>
         <w:tc>
           <w:tcPr>
-            <w:tcW w:w="1531" w:type="dxa"/>
+            <w:tcW w:w="2051" w:type="dxa"/>
           </w:tcPr>
           <w:p>
             <w:r>
@@ -1601,7 +1602,7 @@
         </w:tc>
         <w:tc>
           <w:tcPr>
-            <w:tcW w:w="1954" w:type="dxa"/>
+            <w:tcW w:w="1351" w:type="dxa"/>
           </w:tcPr>
           <w:p>
             <w:r>
@@ -1611,7 +1612,7 @@
         </w:tc>
         <w:tc>
           <w:tcPr>
-            <w:tcW w:w="2285" w:type="dxa"/>
+            <w:tcW w:w="3969" w:type="dxa"/>
           </w:tcPr>
           <w:p>
             <w:r>
@@ -1623,7 +1624,7 @@
       <w:tr>
         <w:tc>
           <w:tcPr>
-            <w:tcW w:w="1881" w:type="dxa"/>
+            <w:tcW w:w="1276" w:type="dxa"/>
           </w:tcPr>
           <w:p>
             <w:r>
@@ -1633,7 +1634,7 @@
         </w:tc>
         <w:tc>
           <w:tcPr>
-            <w:tcW w:w="2224" w:type="dxa"/>
+            <w:tcW w:w="1560" w:type="dxa"/>
           </w:tcPr>
           <w:p>
             <w:r>
@@ -1656,7 +1657,7 @@
         </w:tc>
         <w:tc>
           <w:tcPr>
-            <w:tcW w:w="1749" w:type="dxa"/>
+            <w:tcW w:w="1275" w:type="dxa"/>
           </w:tcPr>
           <w:p>
             <w:r>
@@ -1666,7 +1667,7 @@
         </w:tc>
         <w:tc>
           <w:tcPr>
-            <w:tcW w:w="1531" w:type="dxa"/>
+            <w:tcW w:w="2051" w:type="dxa"/>
           </w:tcPr>
           <w:p>
             <w:r>
@@ -1676,7 +1677,7 @@
         </w:tc>
         <w:tc>
           <w:tcPr>
-            <w:tcW w:w="1954" w:type="dxa"/>
+            <w:tcW w:w="1351" w:type="dxa"/>
           </w:tcPr>
           <w:p>
             <w:r>
@@ -1686,7 +1687,7 @@
         </w:tc>
         <w:tc>
           <w:tcPr>
-            <w:tcW w:w="2285" w:type="dxa"/>
+            <w:tcW w:w="3969" w:type="dxa"/>
           </w:tcPr>
           <w:p>
             <w:r>
@@ -1698,7 +1699,7 @@
       <w:tr>
         <w:tc>
           <w:tcPr>
-            <w:tcW w:w="1881" w:type="dxa"/>
+            <w:tcW w:w="1276" w:type="dxa"/>
           </w:tcPr>
           <w:p>
             <w:r>
@@ -1708,7 +1709,7 @@
         </w:tc>
         <w:tc>
           <w:tcPr>
-            <w:tcW w:w="2224" w:type="dxa"/>
+            <w:tcW w:w="1560" w:type="dxa"/>
           </w:tcPr>
           <w:p>
             <w:r>
@@ -1718,7 +1719,7 @@
         </w:tc>
         <w:tc>
           <w:tcPr>
-            <w:tcW w:w="1749" w:type="dxa"/>
+            <w:tcW w:w="1275" w:type="dxa"/>
           </w:tcPr>
           <w:p>
             <w:r>
@@ -1728,7 +1729,7 @@
         </w:tc>
         <w:tc>
           <w:tcPr>
-            <w:tcW w:w="1531" w:type="dxa"/>
+            <w:tcW w:w="2051" w:type="dxa"/>
           </w:tcPr>
           <w:p>
             <w:r>
@@ -1738,7 +1739,7 @@
         </w:tc>
         <w:tc>
           <w:tcPr>
-            <w:tcW w:w="1954" w:type="dxa"/>
+            <w:tcW w:w="1351" w:type="dxa"/>
           </w:tcPr>
           <w:p>
             <w:r>
@@ -1748,7 +1749,7 @@
         </w:tc>
         <w:tc>
           <w:tcPr>
-            <w:tcW w:w="2285" w:type="dxa"/>
+            <w:tcW w:w="3969" w:type="dxa"/>
           </w:tcPr>
           <w:p>
             <w:r>
@@ -1772,7 +1773,7 @@
       <w:tr>
         <w:tc>
           <w:tcPr>
-            <w:tcW w:w="1881" w:type="dxa"/>
+            <w:tcW w:w="1276" w:type="dxa"/>
           </w:tcPr>
           <w:p>
             <w:r>
@@ -1782,7 +1783,7 @@
         </w:tc>
         <w:tc>
           <w:tcPr>
-            <w:tcW w:w="2224" w:type="dxa"/>
+            <w:tcW w:w="1560" w:type="dxa"/>
           </w:tcPr>
           <w:p>
             <w:r>
@@ -1805,7 +1806,7 @@
         </w:tc>
         <w:tc>
           <w:tcPr>
-            <w:tcW w:w="1749" w:type="dxa"/>
+            <w:tcW w:w="1275" w:type="dxa"/>
           </w:tcPr>
           <w:p>
             <w:r>
@@ -1815,7 +1816,7 @@
         </w:tc>
         <w:tc>
           <w:tcPr>
-            <w:tcW w:w="1531" w:type="dxa"/>
+            <w:tcW w:w="2051" w:type="dxa"/>
           </w:tcPr>
           <w:p>
             <w:r>
@@ -1825,7 +1826,7 @@
         </w:tc>
         <w:tc>
           <w:tcPr>
-            <w:tcW w:w="1954" w:type="dxa"/>
+            <w:tcW w:w="1351" w:type="dxa"/>
           </w:tcPr>
           <w:p>
             <w:r>
@@ -1835,7 +1836,7 @@
         </w:tc>
         <w:tc>
           <w:tcPr>
-            <w:tcW w:w="2285" w:type="dxa"/>
+            <w:tcW w:w="3969" w:type="dxa"/>
           </w:tcPr>
           <w:p>
             <w:r>
@@ -1847,7 +1848,7 @@
       <w:tr>
         <w:tc>
           <w:tcPr>
-            <w:tcW w:w="1881" w:type="dxa"/>
+            <w:tcW w:w="1276" w:type="dxa"/>
           </w:tcPr>
           <w:p>
             <w:r>
@@ -1857,7 +1858,7 @@
         </w:tc>
         <w:tc>
           <w:tcPr>
-            <w:tcW w:w="2224" w:type="dxa"/>
+            <w:tcW w:w="1560" w:type="dxa"/>
           </w:tcPr>
           <w:p>
             <w:r>
@@ -1867,7 +1868,7 @@
         </w:tc>
         <w:tc>
           <w:tcPr>
-            <w:tcW w:w="1749" w:type="dxa"/>
+            <w:tcW w:w="1275" w:type="dxa"/>
           </w:tcPr>
           <w:p>
             <w:r>
@@ -1877,7 +1878,7 @@
         </w:tc>
         <w:tc>
           <w:tcPr>
-            <w:tcW w:w="1531" w:type="dxa"/>
+            <w:tcW w:w="2051" w:type="dxa"/>
           </w:tcPr>
           <w:p>
             <w:r>
@@ -1887,7 +1888,7 @@
         </w:tc>
         <w:tc>
           <w:tcPr>
-            <w:tcW w:w="1954" w:type="dxa"/>
+            <w:tcW w:w="1351" w:type="dxa"/>
           </w:tcPr>
           <w:p>
             <w:r>
@@ -1897,7 +1898,7 @@
         </w:tc>
         <w:tc>
           <w:tcPr>
-            <w:tcW w:w="2285" w:type="dxa"/>
+            <w:tcW w:w="3969" w:type="dxa"/>
           </w:tcPr>
           <w:p>
             <w:r>
@@ -1909,7 +1910,7 @@
       <w:tr>
         <w:tc>
           <w:tcPr>
-            <w:tcW w:w="1881" w:type="dxa"/>
+            <w:tcW w:w="1276" w:type="dxa"/>
           </w:tcPr>
           <w:p>
             <w:r>
@@ -1919,6 +1920,204 @@
               <w:t>booking</w:t>
             </w:r>
             <w:r>
+              <w:t xml:space="preserve">” </w:t>
+            </w:r>
+            <w:r>
+              <w:lastRenderedPageBreak/>
+              <w:t>then delete a “</w:t>
+            </w:r>
+            <w:r>
+              <w:t>booking</w:t>
+            </w:r>
+            <w:r>
+              <w:t>”</w:t>
+            </w:r>
+            <w:r>
+              <w:tab/>
+            </w:r>
+            <w:r>
+              <w:tab/>
+            </w:r>
+            <w:r>
+              <w:tab/>
+            </w:r>
+          </w:p>
+        </w:tc>
+        <w:tc>
+          <w:tcPr>
+            <w:tcW w:w="1560" w:type="dxa"/>
+          </w:tcPr>
+          <w:p>
+            <w:r>
+              <w:lastRenderedPageBreak/>
+              <w:t>Testing</w:t>
+            </w:r>
+            <w:r>
+              <w:t>,</w:t>
+            </w:r>
+            <w:r>
+              <w:t xml:space="preserve"> test, 1</w:t>
+            </w:r>
+          </w:p>
+        </w:tc>
+        <w:tc>
+          <w:tcPr>
+            <w:tcW w:w="1275" w:type="dxa"/>
+          </w:tcPr>
+          <w:p>
+            <w:r>
+              <w:t>Input testing</w:t>
+            </w:r>
+            <w:r>
+              <w:tab/>
+            </w:r>
+            <w:r>
+              <w:tab/>
+            </w:r>
+          </w:p>
+        </w:tc>
+        <w:tc>
+          <w:tcPr>
+            <w:tcW w:w="2051" w:type="dxa"/>
+          </w:tcPr>
+          <w:p>
+            <w:r>
+              <w:t xml:space="preserve">Successfully add and delete a </w:t>
+            </w:r>
+            <w:r>
+              <w:t>booking</w:t>
+            </w:r>
+          </w:p>
+        </w:tc>
+        <w:tc>
+          <w:tcPr>
+            <w:tcW w:w="1351" w:type="dxa"/>
+          </w:tcPr>
+          <w:p>
+            <w:r>
+              <w:t>Unable to add a booking</w:t>
+            </w:r>
+          </w:p>
+        </w:tc>
+        <w:tc>
+          <w:tcPr>
+            <w:tcW w:w="3969" w:type="dxa"/>
+          </w:tcPr>
+          <w:p>
+            <w:r>
+              <w:t>Have not updated the booking system to not need courses</w:t>
+            </w:r>
+          </w:p>
+        </w:tc>
+      </w:tr>
+      <w:tr>
+        <w:tc>
+          <w:tcPr>
+            <w:tcW w:w="1276" w:type="dxa"/>
+          </w:tcPr>
+          <w:p>
+            <w:r>
+              <w:t>Attempt to delete a “</w:t>
+            </w:r>
+            <w:r>
+              <w:t>booking</w:t>
+            </w:r>
+            <w:r>
+              <w:t>”</w:t>
+            </w:r>
+          </w:p>
+        </w:tc>
+        <w:tc>
+          <w:tcPr>
+            <w:tcW w:w="1560" w:type="dxa"/>
+          </w:tcPr>
+          <w:p>
+            <w:r>
+              <w:t>1</w:t>
+            </w:r>
+          </w:p>
+        </w:tc>
+        <w:tc>
+          <w:tcPr>
+            <w:tcW w:w="1275" w:type="dxa"/>
+          </w:tcPr>
+          <w:p>
+            <w:r>
+              <w:t>Input testing</w:t>
+            </w:r>
+            <w:r>
+              <w:t>, and data testing</w:t>
+            </w:r>
+            <w:r>
+              <w:tab/>
+            </w:r>
+            <w:r>
+              <w:tab/>
+            </w:r>
+          </w:p>
+        </w:tc>
+        <w:tc>
+          <w:tcPr>
+            <w:tcW w:w="2051" w:type="dxa"/>
+          </w:tcPr>
+          <w:p>
+            <w:r>
+              <w:t xml:space="preserve">Successfully </w:t>
+            </w:r>
+            <w:r>
+              <w:t>delete a “</w:t>
+            </w:r>
+            <w:r>
+              <w:t>booking</w:t>
+            </w:r>
+            <w:r>
+              <w:t>”</w:t>
+            </w:r>
+          </w:p>
+        </w:tc>
+        <w:tc>
+          <w:tcPr>
+            <w:tcW w:w="1351" w:type="dxa"/>
+          </w:tcPr>
+          <w:p>
+            <w:r>
+              <w:t xml:space="preserve">Successfully </w:t>
+            </w:r>
+            <w:r>
+              <w:t>delete a “</w:t>
+            </w:r>
+            <w:r>
+              <w:t>booking</w:t>
+            </w:r>
+            <w:r>
+              <w:t>”</w:t>
+            </w:r>
+          </w:p>
+        </w:tc>
+        <w:tc>
+          <w:tcPr>
+            <w:tcW w:w="3969" w:type="dxa"/>
+          </w:tcPr>
+          <w:p>
+            <w:r>
+              <w:t>Updated system for deleting</w:t>
+            </w:r>
+          </w:p>
+        </w:tc>
+      </w:tr>
+      <w:tr>
+        <w:tc>
+          <w:tcPr>
+            <w:tcW w:w="1276" w:type="dxa"/>
+          </w:tcPr>
+          <w:p>
+            <w:r>
+              <w:t>Attempt to add “</w:t>
+            </w:r>
+            <w:r>
+              <w:t>booking</w:t>
+            </w:r>
+            <w:r>
               <w:t>” then delete a “</w:t>
             </w:r>
             <w:r>
@@ -1928,6 +2127,9 @@
               <w:t>”</w:t>
             </w:r>
             <w:r>
+              <w:t xml:space="preserve"> (admin page)</w:t>
+            </w:r>
+            <w:r>
               <w:tab/>
             </w:r>
             <w:r>
@@ -1940,7 +2142,7 @@
         </w:tc>
         <w:tc>
           <w:tcPr>
-            <w:tcW w:w="2224" w:type="dxa"/>
+            <w:tcW w:w="1560" w:type="dxa"/>
           </w:tcPr>
           <w:p>
             <w:r>
@@ -1950,13 +2152,22 @@
               <w:t>,</w:t>
             </w:r>
             <w:r>
-              <w:t xml:space="preserve"> test, 1</w:t>
-            </w:r>
-          </w:p>
-        </w:tc>
-        <w:tc>
-          <w:tcPr>
-            <w:tcW w:w="1749" w:type="dxa"/>
+              <w:t xml:space="preserve"> </w:t>
+            </w:r>
+            <w:r>
+              <w:t>16/01/2025</w:t>
+            </w:r>
+            <w:r>
+              <w:t xml:space="preserve">, </w:t>
+            </w:r>
+            <w:r>
+              <w:t>9:34</w:t>
+            </w:r>
+          </w:p>
+        </w:tc>
+        <w:tc>
+          <w:tcPr>
+            <w:tcW w:w="1275" w:type="dxa"/>
           </w:tcPr>
           <w:p>
             <w:r>
@@ -1972,295 +2183,478 @@
         </w:tc>
         <w:tc>
           <w:tcPr>
-            <w:tcW w:w="1531" w:type="dxa"/>
-          </w:tcPr>
-          <w:p>
-            <w:r>
-              <w:t xml:space="preserve">Successfully add and delete a </w:t>
-            </w:r>
-            <w:r>
-              <w:t>booking</w:t>
-            </w:r>
-          </w:p>
-        </w:tc>
-        <w:tc>
-          <w:tcPr>
-            <w:tcW w:w="1954" w:type="dxa"/>
-          </w:tcPr>
-          <w:p>
-            <w:r>
-              <w:t>Unable to add a booking</w:t>
-            </w:r>
-          </w:p>
-        </w:tc>
-        <w:tc>
-          <w:tcPr>
-            <w:tcW w:w="2285" w:type="dxa"/>
-          </w:tcPr>
-          <w:p>
-            <w:r>
-              <w:t>Have not updated the booking system to not need courses</w:t>
-            </w:r>
-          </w:p>
-        </w:tc>
-      </w:tr>
-      <w:tr>
-        <w:tc>
-          <w:tcPr>
-            <w:tcW w:w="1881" w:type="dxa"/>
-          </w:tcPr>
-          <w:p>
+            <w:tcW w:w="2051" w:type="dxa"/>
+          </w:tcPr>
+          <w:p>
+            <w:r>
+              <w:t>Successfully add and delete a booking</w:t>
+            </w:r>
+          </w:p>
+        </w:tc>
+        <w:tc>
+          <w:tcPr>
+            <w:tcW w:w="1351" w:type="dxa"/>
+          </w:tcPr>
+          <w:p>
+            <w:r>
+              <w:t>Successfully add and delete a booking</w:t>
+            </w:r>
+          </w:p>
+        </w:tc>
+        <w:tc>
+          <w:tcPr>
+            <w:tcW w:w="3969" w:type="dxa"/>
+          </w:tcPr>
+          <w:p>
+            <w:r>
+              <w:t>Able to add and delete booked assessments on the admin page</w:t>
+            </w:r>
+          </w:p>
+        </w:tc>
+      </w:tr>
+      <w:tr>
+        <w:tc>
+          <w:tcPr>
+            <w:tcW w:w="1276" w:type="dxa"/>
+          </w:tcPr>
+          <w:p>
+            <w:r>
+              <w:t>Attempt to add “booking”</w:t>
+            </w:r>
+          </w:p>
+        </w:tc>
+        <w:tc>
+          <w:tcPr>
+            <w:tcW w:w="1560" w:type="dxa"/>
+          </w:tcPr>
+          <w:p>
+            <w:r>
+              <w:t>Toby Mathews, 21/01/2025</w:t>
+            </w:r>
+          </w:p>
+        </w:tc>
+        <w:tc>
+          <w:tcPr>
+            <w:tcW w:w="1275" w:type="dxa"/>
+          </w:tcPr>
+          <w:p>
+            <w:r>
+              <w:t>Input testing</w:t>
+            </w:r>
+          </w:p>
+        </w:tc>
+        <w:tc>
+          <w:tcPr>
+            <w:tcW w:w="2051" w:type="dxa"/>
+          </w:tcPr>
+          <w:p>
+            <w:r>
+              <w:t>Successfully add a booking</w:t>
+            </w:r>
+          </w:p>
+        </w:tc>
+        <w:tc>
+          <w:tcPr>
+            <w:tcW w:w="1351" w:type="dxa"/>
+          </w:tcPr>
+          <w:p>
+            <w:r>
+              <w:t>Successfully add a booking</w:t>
+            </w:r>
+          </w:p>
+        </w:tc>
+        <w:tc>
+          <w:tcPr>
+            <w:tcW w:w="3969" w:type="dxa"/>
+          </w:tcPr>
+          <w:p/>
+        </w:tc>
+      </w:tr>
+      <w:tr>
+        <w:tc>
+          <w:tcPr>
+            <w:tcW w:w="1276" w:type="dxa"/>
+          </w:tcPr>
+          <w:p>
+            <w:r>
+              <w:t xml:space="preserve">Ask ai question </w:t>
+            </w:r>
+          </w:p>
+        </w:tc>
+        <w:tc>
+          <w:tcPr>
+            <w:tcW w:w="1560" w:type="dxa"/>
+          </w:tcPr>
+          <w:p>
+            <w:proofErr w:type="spellStart"/>
+            <w:r>
+              <w:t>im</w:t>
+            </w:r>
+            <w:proofErr w:type="spellEnd"/>
+            <w:r>
+              <w:t xml:space="preserve"> sufffering for hypothermia</w:t>
+            </w:r>
+          </w:p>
+        </w:tc>
+        <w:tc>
+          <w:tcPr>
+            <w:tcW w:w="1275" w:type="dxa"/>
+          </w:tcPr>
+          <w:p>
+            <w:r>
+              <w:t>Input testing</w:t>
+            </w:r>
+          </w:p>
+        </w:tc>
+        <w:tc>
+          <w:tcPr>
+            <w:tcW w:w="2051" w:type="dxa"/>
+          </w:tcPr>
+          <w:p>
+            <w:r>
+              <w:t>Successfull</w:t>
+            </w:r>
+            <w:r>
+              <w:t>y get a reasonable response</w:t>
+            </w:r>
+          </w:p>
+        </w:tc>
+        <w:tc>
+          <w:tcPr>
+            <w:tcW w:w="1351" w:type="dxa"/>
+          </w:tcPr>
+          <w:p>
+            <w:r>
+              <w:t>Successfull</w:t>
+            </w:r>
+            <w:r>
+              <w:t>y get a reasonable response</w:t>
+            </w:r>
+          </w:p>
+        </w:tc>
+        <w:tc>
+          <w:tcPr>
+            <w:tcW w:w="3969" w:type="dxa"/>
+          </w:tcPr>
+          <w:p>
+            <w:r>
+              <w:t>Has issue trying to emphasis the words with the ** method will fix</w:t>
+            </w:r>
+          </w:p>
+        </w:tc>
+      </w:tr>
+      <w:tr>
+        <w:tc>
+          <w:tcPr>
+            <w:tcW w:w="1276" w:type="dxa"/>
+          </w:tcPr>
+          <w:p>
+            <w:r>
+              <w:t>Test ai response</w:t>
+            </w:r>
+          </w:p>
+        </w:tc>
+        <w:tc>
+          <w:tcPr>
+            <w:tcW w:w="1560" w:type="dxa"/>
+          </w:tcPr>
+          <w:p>
+            <w:proofErr w:type="spellStart"/>
+            <w:r>
+              <w:t>im</w:t>
+            </w:r>
+            <w:proofErr w:type="spellEnd"/>
+            <w:r>
+              <w:t xml:space="preserve"> sufffering for hypothermia</w:t>
+            </w:r>
+          </w:p>
+        </w:tc>
+        <w:tc>
+          <w:tcPr>
+            <w:tcW w:w="1275" w:type="dxa"/>
+          </w:tcPr>
+          <w:p>
+            <w:r>
+              <w:t>Input testing</w:t>
+            </w:r>
+          </w:p>
+        </w:tc>
+        <w:tc>
+          <w:tcPr>
+            <w:tcW w:w="2051" w:type="dxa"/>
+          </w:tcPr>
+          <w:p>
+            <w:r>
+              <w:t>Successfull</w:t>
+            </w:r>
+            <w:r>
+              <w:t>y get a reasonable response</w:t>
+            </w:r>
+            <w:r>
+              <w:t xml:space="preserve"> without ** </w:t>
+            </w:r>
+          </w:p>
+        </w:tc>
+        <w:tc>
+          <w:tcPr>
+            <w:tcW w:w="1351" w:type="dxa"/>
+          </w:tcPr>
+          <w:p>
+            <w:r>
+              <w:t xml:space="preserve">failed as it said </w:t>
+            </w:r>
+            <w:r>
+              <w:t>Sorry, I can only talk about weather or health.</w:t>
+            </w:r>
+          </w:p>
+          <w:p/>
+        </w:tc>
+        <w:tc>
+          <w:tcPr>
+            <w:tcW w:w="3969" w:type="dxa"/>
+          </w:tcPr>
+          <w:p>
+            <w:r>
+              <w:t xml:space="preserve">Fixed issues with </w:t>
+            </w:r>
+            <w:proofErr w:type="spellStart"/>
+            <w:r>
+              <w:t>cont</w:t>
+            </w:r>
+            <w:proofErr w:type="spellEnd"/>
+            <w:r>
+              <w:t xml:space="preserve"> value not filtering the * properly</w:t>
+            </w:r>
+          </w:p>
+          <w:p>
+            <w:r>
+              <w:t>Old:</w:t>
+            </w:r>
+          </w:p>
+          <w:p>
+            <w:r>
+              <w:t>        &lt;p&gt;${data.response1}&lt;/p&gt;</w:t>
+            </w:r>
+          </w:p>
+          <w:p>
+            <w:r>
+              <w:t>        &lt;p&gt;${data.response2}&lt;/p&gt;</w:t>
+            </w:r>
+          </w:p>
+          <w:p>
+            <w:r>
+              <w:t xml:space="preserve">New: </w:t>
+            </w:r>
+          </w:p>
+          <w:p>
+            <w:r>
+              <w:t> </w:t>
+            </w:r>
+            <w:proofErr w:type="spellStart"/>
+            <w:r>
+              <w:t>const</w:t>
+            </w:r>
+            <w:proofErr w:type="spellEnd"/>
+            <w:r>
+              <w:t xml:space="preserve"> response1 = data.response1 ? data.response1.replace(/\*/g, '') : 'No response1 available';</w:t>
+            </w:r>
+          </w:p>
+          <w:p>
+            <w:r>
+              <w:t xml:space="preserve">        </w:t>
+            </w:r>
+            <w:proofErr w:type="spellStart"/>
+            <w:r>
+              <w:t>document.getElementById</w:t>
+            </w:r>
+            <w:proofErr w:type="spellEnd"/>
+            <w:r>
+              <w:t>("ai-response").</w:t>
+            </w:r>
+            <w:proofErr w:type="spellStart"/>
+            <w:r>
+              <w:t>innerHTML</w:t>
+            </w:r>
+            <w:proofErr w:type="spellEnd"/>
+            <w:r>
+              <w:t xml:space="preserve"> = `</w:t>
+            </w:r>
+          </w:p>
+          <w:p>
+            <w:r>
+              <w:t>        &lt;p&gt;${response1}&lt;/p&gt;</w:t>
+            </w:r>
+          </w:p>
+          <w:p/>
+          <w:p/>
+        </w:tc>
+      </w:tr>
+      <w:tr>
+        <w:tc>
+          <w:tcPr>
+            <w:tcW w:w="1276" w:type="dxa"/>
+          </w:tcPr>
+          <w:p>
+            <w:r>
+              <w:t xml:space="preserve">Test ai </w:t>
+            </w:r>
+            <w:r>
+              <w:t xml:space="preserve">on load </w:t>
+            </w:r>
+            <w:r>
+              <w:t>response</w:t>
+            </w:r>
+          </w:p>
+        </w:tc>
+        <w:tc>
+          <w:tcPr>
+            <w:tcW w:w="1560" w:type="dxa"/>
+          </w:tcPr>
+          <w:p>
+            <w:r>
+              <w:t xml:space="preserve">Locational data </w:t>
+            </w:r>
+          </w:p>
+        </w:tc>
+        <w:tc>
+          <w:tcPr>
+            <w:tcW w:w="1275" w:type="dxa"/>
+          </w:tcPr>
+          <w:p>
+            <w:r>
+              <w:t>Input testing</w:t>
+            </w:r>
+          </w:p>
+        </w:tc>
+        <w:tc>
+          <w:tcPr>
+            <w:tcW w:w="2051" w:type="dxa"/>
+          </w:tcPr>
+          <w:p>
+            <w:r>
+              <w:t>Successfull</w:t>
+            </w:r>
+            <w:r>
+              <w:t xml:space="preserve">y get a reasonable response </w:t>
+            </w:r>
+            <w:r>
+              <w:t xml:space="preserve">that </w:t>
+            </w:r>
             <w:r>
               <w:lastRenderedPageBreak/>
-              <w:t>Attempt to delete a “</w:t>
-            </w:r>
-            <w:r>
-              <w:t>booking</w:t>
-            </w:r>
-            <w:r>
-              <w:t>”</w:t>
-            </w:r>
-          </w:p>
-        </w:tc>
-        <w:tc>
-          <w:tcPr>
-            <w:tcW w:w="2224" w:type="dxa"/>
-          </w:tcPr>
-          <w:p>
-            <w:r>
-              <w:t>1</w:t>
-            </w:r>
-          </w:p>
-        </w:tc>
-        <w:tc>
-          <w:tcPr>
-            <w:tcW w:w="1749" w:type="dxa"/>
+              <w:t xml:space="preserve">give general </w:t>
+            </w:r>
+            <w:r>
+              <w:t xml:space="preserve">weather </w:t>
+            </w:r>
+            <w:r>
+              <w:t>advice</w:t>
+            </w:r>
+          </w:p>
+        </w:tc>
+        <w:tc>
+          <w:tcPr>
+            <w:tcW w:w="1351" w:type="dxa"/>
+          </w:tcPr>
+          <w:p>
+            <w:r>
+              <w:lastRenderedPageBreak/>
+              <w:t>Response was of unsatisfac</w:t>
+            </w:r>
+            <w:r>
+              <w:lastRenderedPageBreak/>
+              <w:t xml:space="preserve">tory quality </w:t>
+            </w:r>
+          </w:p>
+        </w:tc>
+        <w:tc>
+          <w:tcPr>
+            <w:tcW w:w="3969" w:type="dxa"/>
+          </w:tcPr>
+          <w:p>
+            <w:r>
+              <w:lastRenderedPageBreak/>
+              <w:t>Added “</w:t>
+            </w:r>
+            <w:r>
+              <w:t>Recommend that the user goes to the weather page on the current website for more details. as well as the met office</w:t>
+            </w:r>
+          </w:p>
+          <w:p>
+            <w:r>
+              <w:lastRenderedPageBreak/>
+              <w:t>“ to question script</w:t>
+            </w:r>
+          </w:p>
+        </w:tc>
+      </w:tr>
+      <w:tr>
+        <w:tc>
+          <w:tcPr>
+            <w:tcW w:w="1276" w:type="dxa"/>
+          </w:tcPr>
+          <w:p>
+            <w:r>
+              <w:lastRenderedPageBreak/>
+              <w:t>Test ai on load response</w:t>
+            </w:r>
+          </w:p>
+        </w:tc>
+        <w:tc>
+          <w:tcPr>
+            <w:tcW w:w="1560" w:type="dxa"/>
+          </w:tcPr>
+          <w:p>
+            <w:r>
+              <w:t xml:space="preserve">Locational data </w:t>
+            </w:r>
+          </w:p>
+        </w:tc>
+        <w:tc>
+          <w:tcPr>
+            <w:tcW w:w="1275" w:type="dxa"/>
           </w:tcPr>
           <w:p>
             <w:r>
               <w:t>Input testing</w:t>
             </w:r>
-            <w:r>
-              <w:t>, and data testing</w:t>
-            </w:r>
-            <w:r>
-              <w:tab/>
-            </w:r>
-            <w:r>
-              <w:tab/>
-            </w:r>
-          </w:p>
-        </w:tc>
-        <w:tc>
-          <w:tcPr>
-            <w:tcW w:w="1531" w:type="dxa"/>
-          </w:tcPr>
-          <w:p>
-            <w:r>
-              <w:t xml:space="preserve">Successfully </w:t>
-            </w:r>
-            <w:r>
-              <w:t>delete a “</w:t>
-            </w:r>
-            <w:r>
-              <w:t>booking</w:t>
-            </w:r>
-            <w:r>
-              <w:t>”</w:t>
-            </w:r>
-          </w:p>
-        </w:tc>
-        <w:tc>
-          <w:tcPr>
-            <w:tcW w:w="1954" w:type="dxa"/>
-          </w:tcPr>
-          <w:p>
-            <w:r>
-              <w:t xml:space="preserve">Successfully </w:t>
-            </w:r>
-            <w:r>
-              <w:t>delete a “</w:t>
-            </w:r>
-            <w:r>
-              <w:t>booking</w:t>
-            </w:r>
-            <w:r>
-              <w:t>”</w:t>
-            </w:r>
-          </w:p>
-        </w:tc>
-        <w:tc>
-          <w:tcPr>
-            <w:tcW w:w="2285" w:type="dxa"/>
-          </w:tcPr>
-          <w:p>
-            <w:r>
-              <w:t>Updated system for deleting</w:t>
-            </w:r>
-          </w:p>
-        </w:tc>
-      </w:tr>
-      <w:tr>
-        <w:tc>
-          <w:tcPr>
-            <w:tcW w:w="1881" w:type="dxa"/>
-          </w:tcPr>
-          <w:p>
-            <w:r>
-              <w:t>Attempt to add “</w:t>
-            </w:r>
-            <w:r>
-              <w:t>booking</w:t>
-            </w:r>
-            <w:r>
-              <w:t>” then delete a “</w:t>
-            </w:r>
-            <w:r>
-              <w:t>booking</w:t>
-            </w:r>
-            <w:r>
-              <w:t>”</w:t>
-            </w:r>
-            <w:r>
-              <w:t xml:space="preserve"> (admin page)</w:t>
-            </w:r>
-            <w:r>
-              <w:tab/>
-            </w:r>
-            <w:r>
-              <w:tab/>
-            </w:r>
-            <w:r>
-              <w:tab/>
-            </w:r>
-          </w:p>
-        </w:tc>
-        <w:tc>
-          <w:tcPr>
-            <w:tcW w:w="2224" w:type="dxa"/>
-          </w:tcPr>
-          <w:p>
-            <w:r>
-              <w:t>Testing</w:t>
-            </w:r>
-            <w:r>
-              <w:t>,</w:t>
-            </w:r>
-            <w:r>
-              <w:t xml:space="preserve"> </w:t>
-            </w:r>
-            <w:r>
-              <w:t>16/01/2025</w:t>
-            </w:r>
-            <w:r>
-              <w:t xml:space="preserve">, </w:t>
-            </w:r>
-            <w:r>
-              <w:t>9:34</w:t>
-            </w:r>
-          </w:p>
-        </w:tc>
-        <w:tc>
-          <w:tcPr>
-            <w:tcW w:w="1749" w:type="dxa"/>
-          </w:tcPr>
-          <w:p>
-            <w:r>
-              <w:t>Input testing</w:t>
-            </w:r>
-            <w:r>
-              <w:tab/>
-            </w:r>
-            <w:r>
-              <w:tab/>
-            </w:r>
-          </w:p>
-        </w:tc>
-        <w:tc>
-          <w:tcPr>
-            <w:tcW w:w="1531" w:type="dxa"/>
-          </w:tcPr>
-          <w:p>
-            <w:r>
-              <w:t>Successfully add and delete a booking</w:t>
-            </w:r>
-          </w:p>
-        </w:tc>
-        <w:tc>
-          <w:tcPr>
-            <w:tcW w:w="1954" w:type="dxa"/>
-          </w:tcPr>
-          <w:p>
-            <w:r>
-              <w:t>Successfully add and delete a booking</w:t>
-            </w:r>
-          </w:p>
-        </w:tc>
-        <w:tc>
-          <w:tcPr>
-            <w:tcW w:w="2285" w:type="dxa"/>
-          </w:tcPr>
-          <w:p>
-            <w:r>
-              <w:t>Able to add and delete booked assessments on the admin page</w:t>
-            </w:r>
-          </w:p>
-        </w:tc>
-      </w:tr>
-      <w:tr>
-        <w:tc>
-          <w:tcPr>
-            <w:tcW w:w="1881" w:type="dxa"/>
-          </w:tcPr>
-          <w:p>
-            <w:r>
-              <w:t>Attempt to add “booking”</w:t>
-            </w:r>
-          </w:p>
-        </w:tc>
-        <w:tc>
-          <w:tcPr>
-            <w:tcW w:w="2224" w:type="dxa"/>
-          </w:tcPr>
-          <w:p>
-            <w:r>
-              <w:t>Toby Mathews, 21/01/2025</w:t>
-            </w:r>
-          </w:p>
-        </w:tc>
-        <w:tc>
-          <w:tcPr>
-            <w:tcW w:w="1749" w:type="dxa"/>
-          </w:tcPr>
-          <w:p>
-            <w:r>
-              <w:t>Input testing</w:t>
-            </w:r>
-          </w:p>
-        </w:tc>
-        <w:tc>
-          <w:tcPr>
-            <w:tcW w:w="1531" w:type="dxa"/>
-          </w:tcPr>
-          <w:p>
-            <w:r>
-              <w:t>Successfully add a booking</w:t>
-            </w:r>
-          </w:p>
-        </w:tc>
-        <w:tc>
-          <w:tcPr>
-            <w:tcW w:w="1954" w:type="dxa"/>
-          </w:tcPr>
-          <w:p>
-            <w:r>
-              <w:t>Successfully add a booking</w:t>
-            </w:r>
-          </w:p>
-        </w:tc>
-        <w:tc>
-          <w:tcPr>
-            <w:tcW w:w="2285" w:type="dxa"/>
+          </w:p>
+        </w:tc>
+        <w:tc>
+          <w:tcPr>
+            <w:tcW w:w="2051" w:type="dxa"/>
+          </w:tcPr>
+          <w:p>
+            <w:r>
+              <w:t>Successfull</w:t>
+            </w:r>
+            <w:r>
+              <w:t>y get a reasonable response that give general weather advice</w:t>
+            </w:r>
+          </w:p>
+        </w:tc>
+        <w:tc>
+          <w:tcPr>
+            <w:tcW w:w="1351" w:type="dxa"/>
+          </w:tcPr>
+          <w:p>
+            <w:r>
+              <w:t>Successfull</w:t>
+            </w:r>
+            <w:r>
+              <w:t xml:space="preserve">y get a reasonable response that give general </w:t>
+            </w:r>
+            <w:r>
+              <w:t>weather</w:t>
+            </w:r>
+            <w:r>
+              <w:t xml:space="preserve"> advice</w:t>
+            </w:r>
+          </w:p>
+        </w:tc>
+        <w:tc>
+          <w:tcPr>
+            <w:tcW w:w="3969" w:type="dxa"/>
           </w:tcPr>
           <w:p/>
         </w:tc>
@@ -2268,290 +2662,75 @@
       <w:tr>
         <w:tc>
           <w:tcPr>
-            <w:tcW w:w="1881" w:type="dxa"/>
-          </w:tcPr>
-          <w:p>
-            <w:r>
-              <w:t xml:space="preserve">Ask ai question </w:t>
-            </w:r>
-          </w:p>
-        </w:tc>
-        <w:tc>
-          <w:tcPr>
-            <w:tcW w:w="2224" w:type="dxa"/>
-          </w:tcPr>
-          <w:p>
-            <w:proofErr w:type="spellStart"/>
-            <w:r>
-              <w:t>im</w:t>
-            </w:r>
-            <w:proofErr w:type="spellEnd"/>
-            <w:r>
-              <w:t xml:space="preserve"> sufffering for hypothermia</w:t>
-            </w:r>
-          </w:p>
-        </w:tc>
-        <w:tc>
-          <w:tcPr>
-            <w:tcW w:w="1749" w:type="dxa"/>
-          </w:tcPr>
-          <w:p>
-            <w:r>
-              <w:t>Input testing</w:t>
-            </w:r>
-          </w:p>
-        </w:tc>
-        <w:tc>
-          <w:tcPr>
-            <w:tcW w:w="1531" w:type="dxa"/>
-          </w:tcPr>
-          <w:p>
-            <w:r>
-              <w:t>Successfull</w:t>
-            </w:r>
-            <w:r>
-              <w:t>y get a reasonable response</w:t>
-            </w:r>
-          </w:p>
-        </w:tc>
-        <w:tc>
-          <w:tcPr>
-            <w:tcW w:w="1954" w:type="dxa"/>
-          </w:tcPr>
-          <w:p>
-            <w:r>
-              <w:t>Successfull</w:t>
-            </w:r>
-            <w:r>
-              <w:t>y get a reasonable response</w:t>
-            </w:r>
-          </w:p>
-        </w:tc>
-        <w:tc>
-          <w:tcPr>
-            <w:tcW w:w="2285" w:type="dxa"/>
-          </w:tcPr>
-          <w:p>
-            <w:r>
-              <w:t>Has issue trying to emphasis the words with the ** method will fix</w:t>
-            </w:r>
-          </w:p>
-        </w:tc>
-      </w:tr>
-      <w:tr>
-        <w:tc>
-          <w:tcPr>
-            <w:tcW w:w="1881" w:type="dxa"/>
-          </w:tcPr>
-          <w:p>
-            <w:r>
-              <w:t xml:space="preserve">Test ai </w:t>
-            </w:r>
-            <w:proofErr w:type="spellStart"/>
-            <w:r>
-              <w:t>resoponse</w:t>
-            </w:r>
-            <w:proofErr w:type="spellEnd"/>
-          </w:p>
-        </w:tc>
-        <w:tc>
-          <w:tcPr>
-            <w:tcW w:w="2224" w:type="dxa"/>
-          </w:tcPr>
-          <w:p>
-            <w:proofErr w:type="spellStart"/>
-            <w:r>
-              <w:t>im</w:t>
-            </w:r>
-            <w:proofErr w:type="spellEnd"/>
-            <w:r>
-              <w:t xml:space="preserve"> sufffering for hypothermia</w:t>
-            </w:r>
-          </w:p>
-        </w:tc>
-        <w:tc>
-          <w:tcPr>
-            <w:tcW w:w="1749" w:type="dxa"/>
+            <w:tcW w:w="1276" w:type="dxa"/>
           </w:tcPr>
           <w:p/>
         </w:tc>
         <w:tc>
           <w:tcPr>
-            <w:tcW w:w="1531" w:type="dxa"/>
-          </w:tcPr>
-          <w:p>
-            <w:r>
-              <w:t>Successfull</w:t>
-            </w:r>
-            <w:r>
-              <w:t>y get a reasonable response</w:t>
-            </w:r>
-            <w:r>
-              <w:t xml:space="preserve"> without ** </w:t>
-            </w:r>
-          </w:p>
-        </w:tc>
-        <w:tc>
-          <w:tcPr>
-            <w:tcW w:w="1954" w:type="dxa"/>
+            <w:tcW w:w="1560" w:type="dxa"/>
           </w:tcPr>
           <w:p/>
         </w:tc>
         <w:tc>
           <w:tcPr>
-            <w:tcW w:w="2285" w:type="dxa"/>
+            <w:tcW w:w="1275" w:type="dxa"/>
           </w:tcPr>
           <w:p/>
         </w:tc>
-      </w:tr>
-      <w:tr>
-        <w:tc>
-          <w:tcPr>
-            <w:tcW w:w="1881" w:type="dxa"/>
+        <w:tc>
+          <w:tcPr>
+            <w:tcW w:w="2051" w:type="dxa"/>
           </w:tcPr>
           <w:p/>
         </w:tc>
         <w:tc>
           <w:tcPr>
-            <w:tcW w:w="2224" w:type="dxa"/>
+            <w:tcW w:w="1351" w:type="dxa"/>
           </w:tcPr>
           <w:p/>
         </w:tc>
         <w:tc>
           <w:tcPr>
-            <w:tcW w:w="1749" w:type="dxa"/>
+            <w:tcW w:w="3969" w:type="dxa"/>
           </w:tcPr>
           <w:p/>
         </w:tc>
-        <w:tc>
-          <w:tcPr>
-            <w:tcW w:w="1531" w:type="dxa"/>
+      </w:tr>
+      <w:tr>
+        <w:tc>
+          <w:tcPr>
+            <w:tcW w:w="1276" w:type="dxa"/>
           </w:tcPr>
           <w:p/>
         </w:tc>
         <w:tc>
           <w:tcPr>
-            <w:tcW w:w="1954" w:type="dxa"/>
+            <w:tcW w:w="1560" w:type="dxa"/>
           </w:tcPr>
           <w:p/>
         </w:tc>
         <w:tc>
           <w:tcPr>
-            <w:tcW w:w="2285" w:type="dxa"/>
+            <w:tcW w:w="1275" w:type="dxa"/>
           </w:tcPr>
           <w:p/>
         </w:tc>
-      </w:tr>
-      <w:tr>
-        <w:tc>
-          <w:tcPr>
-            <w:tcW w:w="1881" w:type="dxa"/>
+        <w:tc>
+          <w:tcPr>
+            <w:tcW w:w="2051" w:type="dxa"/>
           </w:tcPr>
           <w:p/>
         </w:tc>
         <w:tc>
           <w:tcPr>
-            <w:tcW w:w="2224" w:type="dxa"/>
+            <w:tcW w:w="1351" w:type="dxa"/>
           </w:tcPr>
           <w:p/>
         </w:tc>
         <w:tc>
           <w:tcPr>
-            <w:tcW w:w="1749" w:type="dxa"/>
-          </w:tcPr>
-          <w:p/>
-        </w:tc>
-        <w:tc>
-          <w:tcPr>
-            <w:tcW w:w="1531" w:type="dxa"/>
-          </w:tcPr>
-          <w:p/>
-        </w:tc>
-        <w:tc>
-          <w:tcPr>
-            <w:tcW w:w="1954" w:type="dxa"/>
-          </w:tcPr>
-          <w:p/>
-        </w:tc>
-        <w:tc>
-          <w:tcPr>
-            <w:tcW w:w="2285" w:type="dxa"/>
-          </w:tcPr>
-          <w:p/>
-        </w:tc>
-      </w:tr>
-      <w:tr>
-        <w:tc>
-          <w:tcPr>
-            <w:tcW w:w="1881" w:type="dxa"/>
-          </w:tcPr>
-          <w:p/>
-        </w:tc>
-        <w:tc>
-          <w:tcPr>
-            <w:tcW w:w="2224" w:type="dxa"/>
-          </w:tcPr>
-          <w:p/>
-        </w:tc>
-        <w:tc>
-          <w:tcPr>
-            <w:tcW w:w="1749" w:type="dxa"/>
-          </w:tcPr>
-          <w:p/>
-        </w:tc>
-        <w:tc>
-          <w:tcPr>
-            <w:tcW w:w="1531" w:type="dxa"/>
-          </w:tcPr>
-          <w:p/>
-        </w:tc>
-        <w:tc>
-          <w:tcPr>
-            <w:tcW w:w="1954" w:type="dxa"/>
-          </w:tcPr>
-          <w:p/>
-        </w:tc>
-        <w:tc>
-          <w:tcPr>
-            <w:tcW w:w="2285" w:type="dxa"/>
-          </w:tcPr>
-          <w:p/>
-        </w:tc>
-      </w:tr>
-      <w:tr>
-        <w:tc>
-          <w:tcPr>
-            <w:tcW w:w="1881" w:type="dxa"/>
-          </w:tcPr>
-          <w:p/>
-        </w:tc>
-        <w:tc>
-          <w:tcPr>
-            <w:tcW w:w="2224" w:type="dxa"/>
-          </w:tcPr>
-          <w:p/>
-        </w:tc>
-        <w:tc>
-          <w:tcPr>
-            <w:tcW w:w="1749" w:type="dxa"/>
-          </w:tcPr>
-          <w:p/>
-        </w:tc>
-        <w:tc>
-          <w:tcPr>
-            <w:tcW w:w="1531" w:type="dxa"/>
-          </w:tcPr>
-          <w:p/>
-        </w:tc>
-        <w:tc>
-          <w:tcPr>
-            <w:tcW w:w="1954" w:type="dxa"/>
-          </w:tcPr>
-          <w:p/>
-        </w:tc>
-        <w:tc>
-          <w:tcPr>
-            <w:tcW w:w="2285" w:type="dxa"/>
+            <w:tcW w:w="3969" w:type="dxa"/>
           </w:tcPr>
           <w:p/>
         </w:tc>
@@ -3171,7 +3350,6 @@
   <w:style w:type="character" w:default="1" w:styleId="DefaultParagraphFont">
     <w:name w:val="Default Paragraph Font"/>
     <w:uiPriority w:val="1"/>
-    <w:semiHidden/>
     <w:unhideWhenUsed/>
   </w:style>
   <w:style w:type="table" w:default="1" w:styleId="TableNormal">
@@ -3535,6 +3713,17 @@
       <w:shd w:val="clear" w:color="auto" w:fill="E1DFDD"/>
     </w:rPr>
   </w:style>
+  <w:style w:type="paragraph" w:styleId="NormalWeb">
+    <w:name w:val="Normal (Web)"/>
+    <w:basedOn w:val="Normal"/>
+    <w:uiPriority w:val="99"/>
+    <w:semiHidden/>
+    <w:unhideWhenUsed/>
+    <w:rsid w:val="001375EE"/>
+    <w:rPr>
+      <w:rFonts w:ascii="Times New Roman" w:hAnsi="Times New Roman" w:cs="Times New Roman"/>
+    </w:rPr>
+  </w:style>
 </w:styles>
 </file>
 

</xml_diff>